<commit_message>
Update APPN CALViS Fieldbook with additional equipment details, connection instructions, and new images for enhanced clarity and usability
Co-authored-by: Copilot <copilot@github.com>
</commit_message>
<xml_diff>
--- a/OriginalDocuments/APPN_CALViS_FieldBook_Rev1.0.docx
+++ b/OriginalDocuments/APPN_CALViS_FieldBook_Rev1.0.docx
@@ -576,6 +576,46 @@
       <w:pPr>
         <w:pStyle w:val="ListParagraph"/>
         <w:numPr>
+          <w:ilvl w:val="1"/>
+          <w:numId w:val="46"/>
+        </w:numPr>
+        <w:spacing w:after="40" w:line="240" w:lineRule="auto"/>
+        <w:rPr>
+          <w:rFonts w:ascii="Arial" w:hAnsi="Arial" w:cs="Arial"/>
+        </w:rPr>
+      </w:pPr>
+      <w:r>
+        <w:rPr>
+          <w:rFonts w:ascii="Arial" w:hAnsi="Arial" w:cs="Arial"/>
+        </w:rPr>
+        <w:t>Hyperspectral c</w:t>
+      </w:r>
+      <w:r>
+        <w:rPr>
+          <w:rFonts w:ascii="Arial" w:hAnsi="Arial" w:cs="Arial"/>
+        </w:rPr>
+        <w:t>apture polygon</w:t>
+      </w:r>
+      <w:r>
+        <w:rPr>
+          <w:rFonts w:ascii="Arial" w:hAnsi="Arial" w:cs="Arial"/>
+        </w:rPr>
+        <w:t xml:space="preserve"> exported from </w:t>
+      </w:r>
+      <w:hyperlink r:id="rId11">
+        <w:r>
+          <w:rPr>
+            <w:rStyle w:val="Hyperlink"/>
+            <w:rFonts w:ascii="Arial" w:hAnsi="Arial" w:cs="Arial"/>
+          </w:rPr>
+          <w:t>HPI Polygon Tool</w:t>
+        </w:r>
+      </w:hyperlink>
+    </w:p>
+    <w:p>
+      <w:pPr>
+        <w:pStyle w:val="ListParagraph"/>
+        <w:numPr>
           <w:ilvl w:val="0"/>
           <w:numId w:val="43"/>
         </w:numPr>
@@ -771,62 +811,6 @@
       <w:pPr>
         <w:pStyle w:val="ListParagraph"/>
         <w:numPr>
-          <w:ilvl w:val="1"/>
-          <w:numId w:val="47"/>
-        </w:numPr>
-        <w:spacing w:after="40" w:line="240" w:lineRule="auto"/>
-        <w:rPr>
-          <w:rFonts w:ascii="Arial" w:hAnsi="Arial" w:cs="Arial"/>
-        </w:rPr>
-      </w:pPr>
-      <w:r>
-        <w:rPr>
-          <w:rFonts w:ascii="Arial" w:hAnsi="Arial" w:cs="Arial"/>
-          <w:i/>
-          <w:iCs/>
-        </w:rPr>
-        <w:t xml:space="preserve">If over 50 km from </w:t>
-      </w:r>
-      <w:r>
-        <w:rPr>
-          <w:rFonts w:ascii="Arial" w:hAnsi="Arial" w:cs="Arial"/>
-          <w:i/>
-          <w:iCs/>
-        </w:rPr>
-        <w:t>CORS base station</w:t>
-      </w:r>
-      <w:r>
-        <w:rPr>
-          <w:rFonts w:ascii="Arial" w:hAnsi="Arial" w:cs="Arial"/>
-        </w:rPr>
-        <w:t xml:space="preserve">, </w:t>
-      </w:r>
-      <w:r>
-        <w:rPr>
-          <w:rFonts w:ascii="Arial" w:hAnsi="Arial" w:cs="Arial"/>
-        </w:rPr>
-        <w:t>a portable RTK base station (</w:t>
-      </w:r>
-      <w:hyperlink r:id="rId15" w:history="1">
-        <w:r>
-          <w:rPr>
-            <w:rStyle w:val="Hyperlink"/>
-            <w:rFonts w:ascii="Arial" w:hAnsi="Arial" w:cs="Arial"/>
-          </w:rPr>
-          <w:t>link to GRYFN gitbook</w:t>
-        </w:r>
-      </w:hyperlink>
-      <w:r>
-        <w:rPr>
-          <w:rFonts w:ascii="Arial" w:hAnsi="Arial" w:cs="Arial"/>
-        </w:rPr>
-        <w:t>)</w:t>
-      </w:r>
-    </w:p>
-    <w:p>
-      <w:pPr>
-        <w:pStyle w:val="ListParagraph"/>
-        <w:numPr>
           <w:ilvl w:val="0"/>
           <w:numId w:val="43"/>
         </w:numPr>
@@ -1081,6 +1065,41 @@
     </w:p>
     <w:p>
       <w:pPr>
+        <w:pStyle w:val="ListParagraph"/>
+        <w:numPr>
+          <w:ilvl w:val="1"/>
+          <w:numId w:val="48"/>
+        </w:numPr>
+        <w:spacing w:after="40" w:line="240" w:lineRule="auto"/>
+        <w:rPr>
+          <w:rFonts w:ascii="Arial" w:hAnsi="Arial" w:cs="Arial"/>
+          <w:highlight w:val="yellow"/>
+        </w:rPr>
+      </w:pPr>
+      <w:r>
+        <w:rPr>
+          <w:rFonts w:ascii="Arial" w:hAnsi="Arial" w:cs="Arial"/>
+          <w:highlight w:val="yellow"/>
+        </w:rPr>
+        <w:t xml:space="preserve">Anemometer </w:t>
+      </w:r>
+      <w:r>
+        <w:rPr>
+          <w:rFonts w:ascii="Arial" w:hAnsi="Arial" w:cs="Arial"/>
+          <w:highlight w:val="yellow"/>
+        </w:rPr>
+        <w:t xml:space="preserve">(Kestral </w:t>
+      </w:r>
+      <w:r>
+        <w:rPr>
+          <w:rFonts w:ascii="Arial" w:hAnsi="Arial" w:cs="Arial"/>
+          <w:highlight w:val="yellow"/>
+        </w:rPr>
+        <w:t>LINK HERE)</w:t>
+      </w:r>
+    </w:p>
+    <w:p>
+      <w:pPr>
         <w:spacing w:after="40" w:line="240" w:lineRule="auto"/>
         <w:rPr>
           <w:rFonts w:ascii="Arial" w:hAnsi="Arial" w:cs="Arial"/>
@@ -1126,7 +1145,6 @@
           <w:color w:val="6F901E"/>
           <w:sz w:val="32"/>
         </w:rPr>
-        <w:lastRenderedPageBreak/>
         <w:t>PRE</w:t>
       </w:r>
       <w:r>
@@ -1214,6 +1232,54 @@
           <w:iCs/>
         </w:rPr>
         <w:t xml:space="preserve"> well in advance.</w:t>
+      </w:r>
+      <w:r>
+        <w:rPr>
+          <w:rFonts w:ascii="Arial" w:hAnsi="Arial" w:cs="Arial"/>
+          <w:bCs/>
+          <w:i/>
+          <w:iCs/>
+        </w:rPr>
+        <w:t xml:space="preserve">  </w:t>
+      </w:r>
+      <w:r>
+        <w:rPr>
+          <w:rFonts w:ascii="Arial" w:hAnsi="Arial" w:cs="Arial"/>
+          <w:bCs/>
+          <w:i/>
+          <w:iCs/>
+        </w:rPr>
+        <w:t>Further plannin</w:t>
+      </w:r>
+      <w:r>
+        <w:rPr>
+          <w:rFonts w:ascii="Arial" w:hAnsi="Arial" w:cs="Arial"/>
+          <w:bCs/>
+          <w:i/>
+          <w:iCs/>
+        </w:rPr>
+        <w:t xml:space="preserve">g documentation can be found in the IF1200 manual </w:t>
+      </w:r>
+      <w:hyperlink r:id="rId16" w:history="1">
+        <w:r>
+          <w:rPr>
+            <w:rStyle w:val="Hyperlink"/>
+            <w:rFonts w:ascii="Arial" w:hAnsi="Arial" w:cs="Arial"/>
+            <w:bCs/>
+            <w:i/>
+            <w:iCs/>
+          </w:rPr>
+          <w:t>here</w:t>
+        </w:r>
+      </w:hyperlink>
+      <w:r>
+        <w:rPr>
+          <w:rFonts w:ascii="Arial" w:hAnsi="Arial" w:cs="Arial"/>
+          <w:bCs/>
+          <w:i/>
+          <w:iCs/>
+        </w:rPr>
+        <w:t xml:space="preserve">. </w:t>
       </w:r>
     </w:p>
     <w:p>
@@ -1409,6 +1475,7 @@
         <w:contextualSpacing w:val="0"/>
         <w:rPr>
           <w:rFonts w:ascii="Arial" w:hAnsi="Arial" w:cs="Arial"/>
+          <w:highlight w:val="yellow"/>
         </w:rPr>
       </w:pPr>
       <w:commentRangeStart w:id="8"/>
@@ -1463,7 +1530,7 @@
         </w:rPr>
         <w:t xml:space="preserve">Import the ‘capture’ KML into </w:t>
       </w:r>
-      <w:hyperlink r:id="rId16">
+      <w:hyperlink r:id="rId17">
         <w:r>
           <w:rPr>
             <w:rStyle w:val="Hyperlink"/>
@@ -1506,7 +1573,7 @@
         <w:rPr>
           <w:rFonts w:ascii="Arial" w:hAnsi="Arial" w:cs="Arial"/>
         </w:rPr>
-        <w:t xml:space="preserve"> Hyperspec3. </w:t>
+        <w:t xml:space="preserve"> Hyperspec3.</w:t>
       </w:r>
     </w:p>
     <w:p>
@@ -1521,40 +1588,473 @@
         <w:contextualSpacing w:val="0"/>
         <w:rPr>
           <w:rFonts w:ascii="Arial" w:hAnsi="Arial" w:cs="Arial"/>
-          <w:highlight w:val="yellow"/>
-        </w:rPr>
-      </w:pPr>
-      <w:commentRangeStart w:id="10"/>
-      <w:commentRangeStart w:id="11"/>
-      <w:r>
-        <w:rPr>
-          <w:rFonts w:ascii="Arial" w:hAnsi="Arial" w:cs="Arial"/>
-          <w:highlight w:val="yellow"/>
-        </w:rPr>
-        <w:t xml:space="preserve">Import the ‘Survey’ polygon into QGroundControl. </w:t>
-      </w:r>
-      <w:commentRangeEnd w:id="10"/>
-      <w:r>
-        <w:rPr>
-          <w:rStyle w:val="CommentReference"/>
-          <w:rFonts w:ascii="Arial" w:hAnsi="Arial" w:cs="Arial"/>
-          <w:sz w:val="22"/>
-          <w:szCs w:val="22"/>
-          <w:highlight w:val="yellow"/>
-        </w:rPr>
-        <w:commentReference w:id="10"/>
-      </w:r>
-      <w:commentRangeEnd w:id="11"/>
-      <w:r>
-        <w:rPr>
-          <w:rStyle w:val="CommentReference"/>
-          <w:rFonts w:ascii="Arial" w:hAnsi="Arial" w:cs="Arial"/>
-          <w:sz w:val="22"/>
-          <w:szCs w:val="22"/>
-          <w:highlight w:val="yellow"/>
-        </w:rPr>
-        <w:commentReference w:id="11"/>
-      </w:r>
+        </w:rPr>
+      </w:pPr>
+      <w:r>
+        <w:rPr>
+          <w:rFonts w:ascii="Arial" w:hAnsi="Arial" w:cs="Arial"/>
+        </w:rPr>
+        <w:t>Open QGroundControl</w:t>
+      </w:r>
+      <w:r>
+        <w:rPr>
+          <w:rFonts w:ascii="Arial" w:hAnsi="Arial" w:cs="Arial"/>
+        </w:rPr>
+        <w:t xml:space="preserve"> (QGC)</w:t>
+      </w:r>
+      <w:r>
+        <w:rPr>
+          <w:rFonts w:ascii="Arial" w:hAnsi="Arial" w:cs="Arial"/>
+        </w:rPr>
+        <w:t xml:space="preserve"> (</w:t>
+      </w:r>
+      <w:hyperlink r:id="rId18" w:history="1">
+        <w:r>
+          <w:rPr>
+            <w:rStyle w:val="Hyperlink"/>
+            <w:rFonts w:ascii="Arial" w:hAnsi="Arial" w:cs="Arial"/>
+          </w:rPr>
+          <w:t>Downloa</w:t>
+        </w:r>
+        <w:r>
+          <w:rPr>
+            <w:rStyle w:val="Hyperlink"/>
+            <w:rFonts w:ascii="Arial" w:hAnsi="Arial" w:cs="Arial"/>
+          </w:rPr>
+          <w:t>d</w:t>
+        </w:r>
+        <w:r>
+          <w:rPr>
+            <w:rStyle w:val="Hyperlink"/>
+            <w:rFonts w:ascii="Arial" w:hAnsi="Arial" w:cs="Arial"/>
+          </w:rPr>
+          <w:t xml:space="preserve"> here</w:t>
+        </w:r>
+      </w:hyperlink>
+      <w:r>
+        <w:rPr>
+          <w:rFonts w:ascii="Arial" w:hAnsi="Arial" w:cs="Arial"/>
+        </w:rPr>
+        <w:t>)</w:t>
+      </w:r>
+      <w:r>
+        <w:rPr>
+          <w:rFonts w:ascii="Arial" w:hAnsi="Arial" w:cs="Arial"/>
+        </w:rPr>
+        <w:t xml:space="preserve"> </w:t>
+      </w:r>
+      <w:r>
+        <w:rPr>
+          <w:rFonts w:ascii="Arial" w:hAnsi="Arial" w:cs="Arial"/>
+        </w:rPr>
+        <w:t xml:space="preserve">on a PC </w:t>
+      </w:r>
+      <w:r>
+        <w:rPr>
+          <w:rFonts w:ascii="Arial" w:hAnsi="Arial" w:cs="Arial"/>
+        </w:rPr>
+        <w:t xml:space="preserve">and </w:t>
+      </w:r>
+      <w:r>
+        <w:rPr>
+          <w:rFonts w:ascii="Arial" w:hAnsi="Arial" w:cs="Arial"/>
+        </w:rPr>
+        <w:t xml:space="preserve">connect a USB-A </w:t>
+      </w:r>
+      <w:r>
+        <w:rPr>
+          <w:rFonts w:ascii="Arial" w:hAnsi="Arial" w:cs="Arial"/>
+        </w:rPr>
+        <w:t xml:space="preserve">to the PC and </w:t>
+      </w:r>
+      <w:r>
+        <w:rPr>
+          <w:rFonts w:ascii="Arial" w:hAnsi="Arial" w:cs="Arial"/>
+        </w:rPr>
+        <w:t xml:space="preserve">USB-C into the </w:t>
+      </w:r>
+      <w:r>
+        <w:rPr>
+          <w:rFonts w:ascii="Arial" w:hAnsi="Arial" w:cs="Arial"/>
+        </w:rPr>
+        <w:t>USB-C</w:t>
+      </w:r>
+      <w:r>
+        <w:rPr>
+          <w:rFonts w:ascii="Arial" w:hAnsi="Arial" w:cs="Arial"/>
+        </w:rPr>
+        <w:t xml:space="preserve"> </w:t>
+      </w:r>
+      <w:r>
+        <w:rPr>
+          <w:rFonts w:ascii="Arial" w:hAnsi="Arial" w:cs="Arial"/>
+        </w:rPr>
+        <w:t xml:space="preserve">port at the top of the IF1200. </w:t>
+      </w:r>
+    </w:p>
+    <w:p>
+      <w:pPr>
+        <w:pStyle w:val="ListParagraph"/>
+        <w:numPr>
+          <w:ilvl w:val="1"/>
+          <w:numId w:val="1"/>
+        </w:numPr>
+        <w:spacing w:after="120" w:line="288" w:lineRule="auto"/>
+        <w:contextualSpacing w:val="0"/>
+        <w:rPr>
+          <w:rFonts w:ascii="Arial" w:hAnsi="Arial" w:cs="Arial"/>
+        </w:rPr>
+      </w:pPr>
+      <w:r>
+        <w:rPr>
+          <w:rFonts w:ascii="Arial" w:hAnsi="Arial" w:cs="Arial"/>
+        </w:rPr>
+        <w:t>Set</w:t>
+      </w:r>
+      <w:r>
+        <w:rPr>
+          <w:rFonts w:ascii="Arial" w:hAnsi="Arial" w:cs="Arial"/>
+        </w:rPr>
+        <w:t>up a comm link in QGC</w:t>
+      </w:r>
+      <w:r>
+        <w:rPr>
+          <w:rFonts w:ascii="Arial" w:hAnsi="Arial" w:cs="Arial"/>
+        </w:rPr>
+        <w:t xml:space="preserve"> by pressing the Q </w:t>
+      </w:r>
+    </w:p>
+    <w:p>
+      <w:pPr>
+        <w:pStyle w:val="ListParagraph"/>
+        <w:spacing w:after="120" w:line="288" w:lineRule="auto"/>
+        <w:ind w:left="1440"/>
+        <w:contextualSpacing w:val="0"/>
+        <w:rPr>
+          <w:rFonts w:ascii="Arial" w:hAnsi="Arial" w:cs="Arial"/>
+        </w:rPr>
+      </w:pPr>
+      <w:r>
+        <w:rPr>
+          <w:rFonts w:ascii="Arial" w:hAnsi="Arial" w:cs="Arial"/>
+        </w:rPr>
+        <w:t>in the top left of QGC</w:t>
+      </w:r>
+      <w:r>
+        <w:rPr>
+          <w:rFonts w:ascii="Arial" w:hAnsi="Arial" w:cs="Arial"/>
+        </w:rPr>
+        <w:t>.</w:t>
+      </w:r>
+    </w:p>
+    <w:p>
+      <w:pPr>
+        <w:pStyle w:val="ListParagraph"/>
+        <w:numPr>
+          <w:ilvl w:val="1"/>
+          <w:numId w:val="1"/>
+        </w:numPr>
+        <w:spacing w:after="120" w:line="288" w:lineRule="auto"/>
+        <w:contextualSpacing w:val="0"/>
+        <w:rPr>
+          <w:rFonts w:ascii="Arial" w:hAnsi="Arial" w:cs="Arial"/>
+        </w:rPr>
+      </w:pPr>
+      <w:r>
+        <w:rPr>
+          <w:rFonts w:ascii="Arial" w:hAnsi="Arial" w:cs="Arial"/>
+        </w:rPr>
+        <w:t>Navigate to ‘Application Settings’</w:t>
+      </w:r>
+      <w:r>
+        <w:rPr>
+          <w:rFonts w:ascii="Arial" w:hAnsi="Arial" w:cs="Arial"/>
+        </w:rPr>
+        <w:t xml:space="preserve"> &gt; ‘Comm Links’</w:t>
+      </w:r>
+    </w:p>
+    <w:p>
+      <w:pPr>
+        <w:pStyle w:val="ListParagraph"/>
+        <w:numPr>
+          <w:ilvl w:val="1"/>
+          <w:numId w:val="1"/>
+        </w:numPr>
+        <w:spacing w:after="120" w:line="288" w:lineRule="auto"/>
+        <w:contextualSpacing w:val="0"/>
+        <w:rPr>
+          <w:rFonts w:ascii="Arial" w:hAnsi="Arial" w:cs="Arial"/>
+        </w:rPr>
+      </w:pPr>
+      <w:r>
+        <w:rPr>
+          <w:rFonts w:ascii="Arial" w:hAnsi="Arial" w:cs="Arial"/>
+        </w:rPr>
+        <w:t>Click the ‘Add’ button</w:t>
+      </w:r>
+    </w:p>
+    <w:p>
+      <w:pPr>
+        <w:pStyle w:val="ListParagraph"/>
+        <w:numPr>
+          <w:ilvl w:val="1"/>
+          <w:numId w:val="1"/>
+        </w:numPr>
+        <w:spacing w:after="120" w:line="288" w:lineRule="auto"/>
+        <w:contextualSpacing w:val="0"/>
+        <w:rPr>
+          <w:rFonts w:ascii="Arial" w:hAnsi="Arial" w:cs="Arial"/>
+        </w:rPr>
+      </w:pPr>
+      <w:r>
+        <w:rPr>
+          <w:rFonts w:ascii="Arial" w:hAnsi="Arial" w:cs="Arial"/>
+        </w:rPr>
+        <w:t>Name your comm link</w:t>
+      </w:r>
+      <w:r>
+        <w:rPr>
+          <w:rFonts w:ascii="Arial" w:hAnsi="Arial" w:cs="Arial"/>
+        </w:rPr>
+        <w:t xml:space="preserve"> and change the settings </w:t>
+      </w:r>
+    </w:p>
+    <w:p>
+      <w:pPr>
+        <w:pStyle w:val="ListParagraph"/>
+        <w:spacing w:after="120" w:line="288" w:lineRule="auto"/>
+        <w:ind w:left="1440"/>
+        <w:contextualSpacing w:val="0"/>
+        <w:rPr>
+          <w:noProof/>
+        </w:rPr>
+      </w:pPr>
+      <w:r>
+        <w:rPr>
+          <w:rFonts w:ascii="Arial" w:hAnsi="Arial" w:cs="Arial"/>
+        </w:rPr>
+        <w:t>As displayed. (Photo)</w:t>
+      </w:r>
+      <w:r>
+        <w:rPr>
+          <w:noProof/>
+        </w:rPr>
+        <w:t xml:space="preserve"> </w:t>
+      </w:r>
+    </w:p>
+    <w:p>
+      <w:pPr>
+        <w:spacing w:after="120" w:line="288" w:lineRule="auto"/>
+        <w:rPr>
+          <w:noProof/>
+        </w:rPr>
+      </w:pPr>
+      <w:r>
+        <w:rPr>
+          <w:noProof/>
+        </w:rPr>
+        <w:drawing>
+          <wp:anchor distT="0" distB="0" distL="114300" distR="114300" simplePos="0" relativeHeight="251658240" behindDoc="1" locked="0" layoutInCell="1" allowOverlap="1" wp14:anchorId="6344EE06" wp14:editId="00ADAA2D">
+            <wp:simplePos x="0" y="0"/>
+            <wp:positionH relativeFrom="column">
+              <wp:posOffset>933450</wp:posOffset>
+            </wp:positionH>
+            <wp:positionV relativeFrom="paragraph">
+              <wp:posOffset>5715</wp:posOffset>
+            </wp:positionV>
+            <wp:extent cx="2006600" cy="2278830"/>
+            <wp:effectExtent l="0" t="0" r="0" b="7620"/>
+            <wp:wrapNone/>
+            <wp:docPr id="1586277286" name="Picture 1"/>
+            <wp:cNvGraphicFramePr>
+              <a:graphicFrameLocks xmlns:a="http://schemas.openxmlformats.org/drawingml/2006/main" noChangeAspect="1"/>
+            </wp:cNvGraphicFramePr>
+            <a:graphic xmlns:a="http://schemas.openxmlformats.org/drawingml/2006/main">
+              <a:graphicData uri="http://schemas.openxmlformats.org/drawingml/2006/picture">
+                <pic:pic xmlns:pic="http://schemas.openxmlformats.org/drawingml/2006/picture">
+                  <pic:nvPicPr>
+                    <pic:cNvPr id="1586277286" name=""/>
+                    <pic:cNvPicPr/>
+                  </pic:nvPicPr>
+                  <pic:blipFill>
+                    <a:blip r:embed="rId19"/>
+                    <a:stretch>
+                      <a:fillRect/>
+                    </a:stretch>
+                  </pic:blipFill>
+                  <pic:spPr>
+                    <a:xfrm>
+                      <a:off x="0" y="0"/>
+                      <a:ext cx="2006600" cy="2278830"/>
+                    </a:xfrm>
+                    <a:prstGeom prst="rect">
+                      <a:avLst/>
+                    </a:prstGeom>
+                  </pic:spPr>
+                </pic:pic>
+              </a:graphicData>
+            </a:graphic>
+            <wp14:sizeRelH relativeFrom="margin">
+              <wp14:pctWidth>0</wp14:pctWidth>
+            </wp14:sizeRelH>
+            <wp14:sizeRelV relativeFrom="margin">
+              <wp14:pctHeight>0</wp14:pctHeight>
+            </wp14:sizeRelV>
+          </wp:anchor>
+        </w:drawing>
+      </w:r>
+    </w:p>
+    <w:p>
+      <w:pPr>
+        <w:pStyle w:val="ListParagraph"/>
+        <w:spacing w:after="120" w:line="288" w:lineRule="auto"/>
+        <w:ind w:left="1440"/>
+        <w:contextualSpacing w:val="0"/>
+        <w:rPr>
+          <w:noProof/>
+        </w:rPr>
+      </w:pPr>
+    </w:p>
+    <w:p>
+      <w:pPr>
+        <w:pStyle w:val="ListParagraph"/>
+        <w:spacing w:after="120" w:line="288" w:lineRule="auto"/>
+        <w:ind w:left="1440"/>
+        <w:contextualSpacing w:val="0"/>
+        <w:rPr>
+          <w:noProof/>
+        </w:rPr>
+      </w:pPr>
+    </w:p>
+    <w:p>
+      <w:pPr>
+        <w:pStyle w:val="ListParagraph"/>
+        <w:spacing w:after="120" w:line="288" w:lineRule="auto"/>
+        <w:ind w:left="1440"/>
+        <w:contextualSpacing w:val="0"/>
+        <w:rPr>
+          <w:noProof/>
+        </w:rPr>
+      </w:pPr>
+    </w:p>
+    <w:p>
+      <w:pPr>
+        <w:pStyle w:val="ListParagraph"/>
+        <w:spacing w:after="120" w:line="288" w:lineRule="auto"/>
+        <w:ind w:left="1440"/>
+        <w:contextualSpacing w:val="0"/>
+        <w:rPr>
+          <w:noProof/>
+        </w:rPr>
+      </w:pPr>
+    </w:p>
+    <w:p>
+      <w:pPr>
+        <w:pStyle w:val="ListParagraph"/>
+        <w:spacing w:after="120" w:line="288" w:lineRule="auto"/>
+        <w:ind w:left="1440"/>
+        <w:contextualSpacing w:val="0"/>
+        <w:rPr>
+          <w:noProof/>
+        </w:rPr>
+      </w:pPr>
+    </w:p>
+    <w:p>
+      <w:pPr>
+        <w:pStyle w:val="ListParagraph"/>
+        <w:spacing w:after="120" w:line="288" w:lineRule="auto"/>
+        <w:ind w:left="1440"/>
+        <w:contextualSpacing w:val="0"/>
+        <w:rPr>
+          <w:noProof/>
+        </w:rPr>
+      </w:pPr>
+    </w:p>
+    <w:p>
+      <w:pPr>
+        <w:pStyle w:val="ListParagraph"/>
+        <w:spacing w:after="120" w:line="288" w:lineRule="auto"/>
+        <w:ind w:left="1440"/>
+        <w:contextualSpacing w:val="0"/>
+        <w:rPr>
+          <w:noProof/>
+        </w:rPr>
+      </w:pPr>
+    </w:p>
+    <w:p>
+      <w:pPr>
+        <w:pStyle w:val="ListParagraph"/>
+        <w:spacing w:after="120" w:line="288" w:lineRule="auto"/>
+        <w:ind w:left="1440"/>
+        <w:contextualSpacing w:val="0"/>
+        <w:rPr>
+          <w:noProof/>
+        </w:rPr>
+      </w:pPr>
+    </w:p>
+    <w:p>
+      <w:pPr>
+        <w:pStyle w:val="ListParagraph"/>
+        <w:numPr>
+          <w:ilvl w:val="1"/>
+          <w:numId w:val="1"/>
+        </w:numPr>
+        <w:spacing w:after="120" w:line="288" w:lineRule="auto"/>
+        <w:contextualSpacing w:val="0"/>
+        <w:rPr>
+          <w:rFonts w:ascii="Arial" w:hAnsi="Arial" w:cs="Arial"/>
+        </w:rPr>
+      </w:pPr>
+      <w:r>
+        <w:rPr>
+          <w:rFonts w:ascii="Arial" w:hAnsi="Arial" w:cs="Arial"/>
+        </w:rPr>
+        <w:t xml:space="preserve">Once this is complete the IF1200 should now connect to a PC when QGC is open. </w:t>
+      </w:r>
+      <w:r>
+        <w:rPr>
+          <w:rFonts w:ascii="Arial" w:hAnsi="Arial" w:cs="Arial"/>
+        </w:rPr>
+        <w:t>Allowing you up ‘upload’ flight missions</w:t>
+      </w:r>
+      <w:r>
+        <w:rPr>
+          <w:rFonts w:ascii="Arial" w:hAnsi="Arial" w:cs="Arial"/>
+        </w:rPr>
+        <w:t xml:space="preserve"> by using a wired connection.  </w:t>
+      </w:r>
+    </w:p>
+    <w:p>
+      <w:pPr>
+        <w:spacing w:after="120" w:line="288" w:lineRule="auto"/>
+        <w:rPr>
+          <w:rFonts w:ascii="Arial" w:hAnsi="Arial" w:cs="Arial"/>
+        </w:rPr>
+      </w:pPr>
+    </w:p>
+    <w:p>
+      <w:pPr>
+        <w:spacing w:after="120" w:line="288" w:lineRule="auto"/>
+        <w:rPr>
+          <w:rFonts w:ascii="Arial" w:hAnsi="Arial" w:cs="Arial"/>
+        </w:rPr>
+      </w:pPr>
+    </w:p>
+    <w:p>
+      <w:pPr>
+        <w:spacing w:after="120" w:line="288" w:lineRule="auto"/>
+        <w:rPr>
+          <w:rFonts w:ascii="Arial" w:hAnsi="Arial" w:cs="Arial"/>
+        </w:rPr>
+      </w:pPr>
+    </w:p>
+    <w:p>
+      <w:pPr>
+        <w:spacing w:after="120" w:line="288" w:lineRule="auto"/>
+        <w:rPr>
+          <w:rFonts w:ascii="Arial" w:hAnsi="Arial" w:cs="Arial"/>
+        </w:rPr>
+      </w:pPr>
     </w:p>
     <w:p>
       <w:pPr>
@@ -1574,6 +2074,460 @@
         <w:rPr>
           <w:rFonts w:ascii="Arial" w:hAnsi="Arial" w:cs="Arial"/>
         </w:rPr>
+        <w:t xml:space="preserve">Using the </w:t>
+      </w:r>
+      <w:r>
+        <w:rPr>
+          <w:rFonts w:ascii="Arial" w:hAnsi="Arial" w:cs="Arial"/>
+        </w:rPr>
+        <w:t xml:space="preserve">‘survey’ polygon previously created </w:t>
+      </w:r>
+      <w:r>
+        <w:rPr>
+          <w:rFonts w:ascii="Arial" w:hAnsi="Arial" w:cs="Arial"/>
+        </w:rPr>
+        <w:t>use QG</w:t>
+      </w:r>
+      <w:r>
+        <w:rPr>
+          <w:rFonts w:ascii="Arial" w:hAnsi="Arial" w:cs="Arial"/>
+        </w:rPr>
+        <w:t xml:space="preserve">C to create a survey of the area of interest. </w:t>
+      </w:r>
+    </w:p>
+    <w:tbl>
+      <w:tblPr>
+        <w:tblStyle w:val="TableGrid"/>
+        <w:tblW w:w="0" w:type="auto"/>
+        <w:tblBorders>
+          <w:top w:val="none" w:sz="0" w:space="0" w:color="auto"/>
+          <w:left w:val="none" w:sz="0" w:space="0" w:color="auto"/>
+          <w:bottom w:val="none" w:sz="0" w:space="0" w:color="auto"/>
+          <w:right w:val="none" w:sz="0" w:space="0" w:color="auto"/>
+          <w:insideH w:val="none" w:sz="0" w:space="0" w:color="auto"/>
+          <w:insideV w:val="none" w:sz="0" w:space="0" w:color="auto"/>
+        </w:tblBorders>
+        <w:tblLook w:val="04A0" w:firstRow="1" w:lastRow="0" w:firstColumn="1" w:lastColumn="0" w:noHBand="0" w:noVBand="1"/>
+      </w:tblPr>
+      <w:tblGrid>
+        <w:gridCol w:w="5225"/>
+        <w:gridCol w:w="5225"/>
+      </w:tblGrid>
+      <w:tr>
+        <w:tc>
+          <w:tcPr>
+            <w:tcW w:w="5225" w:type="dxa"/>
+          </w:tcPr>
+          <w:p>
+            <w:pPr>
+              <w:pStyle w:val="ListParagraph"/>
+              <w:numPr>
+                <w:ilvl w:val="1"/>
+                <w:numId w:val="1"/>
+              </w:numPr>
+              <w:spacing w:after="120" w:line="288" w:lineRule="auto"/>
+              <w:rPr>
+                <w:rFonts w:ascii="Arial" w:hAnsi="Arial" w:cs="Arial"/>
+              </w:rPr>
+            </w:pPr>
+            <w:r>
+              <w:rPr>
+                <w:rFonts w:ascii="Arial" w:hAnsi="Arial" w:cs="Arial"/>
+              </w:rPr>
+              <w:t xml:space="preserve">Navigate to </w:t>
+            </w:r>
+            <w:r>
+              <w:rPr>
+                <w:rFonts w:ascii="Arial" w:hAnsi="Arial" w:cs="Arial"/>
+              </w:rPr>
+              <w:t>‘flight plan’ by pressing the Q at the top left of QGC</w:t>
+            </w:r>
+          </w:p>
+        </w:tc>
+        <w:tc>
+          <w:tcPr>
+            <w:tcW w:w="5225" w:type="dxa"/>
+          </w:tcPr>
+          <w:p>
+            <w:pPr>
+              <w:spacing w:after="120" w:line="288" w:lineRule="auto"/>
+              <w:rPr>
+                <w:rFonts w:ascii="Arial" w:hAnsi="Arial" w:cs="Arial"/>
+              </w:rPr>
+            </w:pPr>
+            <w:r>
+              <w:rPr>
+                <w:rFonts w:ascii="Arial" w:hAnsi="Arial" w:cs="Arial"/>
+              </w:rPr>
+              <w:drawing>
+                <wp:inline distT="0" distB="0" distL="0" distR="0" wp14:anchorId="20DA4955" wp14:editId="1C1648E8">
+                  <wp:extent cx="1805394" cy="2616200"/>
+                  <wp:effectExtent l="0" t="0" r="4445" b="0"/>
+                  <wp:docPr id="506025082" name="Picture 1"/>
+                  <wp:cNvGraphicFramePr>
+                    <a:graphicFrameLocks xmlns:a="http://schemas.openxmlformats.org/drawingml/2006/main" noChangeAspect="1"/>
+                  </wp:cNvGraphicFramePr>
+                  <a:graphic xmlns:a="http://schemas.openxmlformats.org/drawingml/2006/main">
+                    <a:graphicData uri="http://schemas.openxmlformats.org/drawingml/2006/picture">
+                      <pic:pic xmlns:pic="http://schemas.openxmlformats.org/drawingml/2006/picture">
+                        <pic:nvPicPr>
+                          <pic:cNvPr id="506025082" name=""/>
+                          <pic:cNvPicPr/>
+                        </pic:nvPicPr>
+                        <pic:blipFill>
+                          <a:blip r:embed="rId20"/>
+                          <a:stretch>
+                            <a:fillRect/>
+                          </a:stretch>
+                        </pic:blipFill>
+                        <pic:spPr>
+                          <a:xfrm>
+                            <a:off x="0" y="0"/>
+                            <a:ext cx="1808031" cy="2620021"/>
+                          </a:xfrm>
+                          <a:prstGeom prst="rect">
+                            <a:avLst/>
+                          </a:prstGeom>
+                        </pic:spPr>
+                      </pic:pic>
+                    </a:graphicData>
+                  </a:graphic>
+                </wp:inline>
+              </w:drawing>
+            </w:r>
+          </w:p>
+        </w:tc>
+      </w:tr>
+      <w:tr>
+        <w:tc>
+          <w:tcPr>
+            <w:tcW w:w="5225" w:type="dxa"/>
+          </w:tcPr>
+          <w:p>
+            <w:pPr>
+              <w:pStyle w:val="ListParagraph"/>
+              <w:numPr>
+                <w:ilvl w:val="1"/>
+                <w:numId w:val="1"/>
+              </w:numPr>
+              <w:spacing w:after="120" w:line="288" w:lineRule="auto"/>
+              <w:rPr>
+                <w:rFonts w:ascii="Arial" w:hAnsi="Arial" w:cs="Arial"/>
+              </w:rPr>
+            </w:pPr>
+            <w:r>
+              <w:rPr>
+                <w:rFonts w:ascii="Arial" w:hAnsi="Arial" w:cs="Arial"/>
+              </w:rPr>
+              <w:t>Select ‘Pattern’ &gt; ‘Survey’.  From the options on the LHS.</w:t>
+            </w:r>
+          </w:p>
+        </w:tc>
+        <w:tc>
+          <w:tcPr>
+            <w:tcW w:w="5225" w:type="dxa"/>
+          </w:tcPr>
+          <w:p>
+            <w:pPr>
+              <w:spacing w:after="120" w:line="288" w:lineRule="auto"/>
+              <w:rPr>
+                <w:rFonts w:ascii="Arial" w:hAnsi="Arial" w:cs="Arial"/>
+              </w:rPr>
+            </w:pPr>
+            <w:r>
+              <w:rPr>
+                <w:rFonts w:ascii="Arial" w:hAnsi="Arial" w:cs="Arial"/>
+              </w:rPr>
+              <w:drawing>
+                <wp:inline distT="0" distB="0" distL="0" distR="0" wp14:anchorId="265C95A0" wp14:editId="11EA400C">
+                  <wp:extent cx="1511300" cy="2669079"/>
+                  <wp:effectExtent l="0" t="0" r="0" b="0"/>
+                  <wp:docPr id="88447138" name="Picture 1"/>
+                  <wp:cNvGraphicFramePr>
+                    <a:graphicFrameLocks xmlns:a="http://schemas.openxmlformats.org/drawingml/2006/main" noChangeAspect="1"/>
+                  </wp:cNvGraphicFramePr>
+                  <a:graphic xmlns:a="http://schemas.openxmlformats.org/drawingml/2006/main">
+                    <a:graphicData uri="http://schemas.openxmlformats.org/drawingml/2006/picture">
+                      <pic:pic xmlns:pic="http://schemas.openxmlformats.org/drawingml/2006/picture">
+                        <pic:nvPicPr>
+                          <pic:cNvPr id="88447138" name=""/>
+                          <pic:cNvPicPr/>
+                        </pic:nvPicPr>
+                        <pic:blipFill>
+                          <a:blip r:embed="rId21"/>
+                          <a:stretch>
+                            <a:fillRect/>
+                          </a:stretch>
+                        </pic:blipFill>
+                        <pic:spPr>
+                          <a:xfrm>
+                            <a:off x="0" y="0"/>
+                            <a:ext cx="1513850" cy="2673583"/>
+                          </a:xfrm>
+                          <a:prstGeom prst="rect">
+                            <a:avLst/>
+                          </a:prstGeom>
+                        </pic:spPr>
+                      </pic:pic>
+                    </a:graphicData>
+                  </a:graphic>
+                </wp:inline>
+              </w:drawing>
+            </w:r>
+          </w:p>
+        </w:tc>
+      </w:tr>
+      <w:tr>
+        <w:tc>
+          <w:tcPr>
+            <w:tcW w:w="5225" w:type="dxa"/>
+          </w:tcPr>
+          <w:p>
+            <w:pPr>
+              <w:pStyle w:val="ListParagraph"/>
+              <w:numPr>
+                <w:ilvl w:val="1"/>
+                <w:numId w:val="1"/>
+              </w:numPr>
+              <w:spacing w:after="120" w:line="288" w:lineRule="auto"/>
+              <w:rPr>
+                <w:rFonts w:ascii="Arial" w:hAnsi="Arial" w:cs="Arial"/>
+              </w:rPr>
+            </w:pPr>
+            <w:r>
+              <w:rPr>
+                <w:rFonts w:ascii="Arial" w:hAnsi="Arial" w:cs="Arial"/>
+              </w:rPr>
+              <w:t>Select ‘Load KML/SHP’</w:t>
+            </w:r>
+            <w:r>
+              <w:rPr>
+                <w:rFonts w:ascii="Arial" w:hAnsi="Arial" w:cs="Arial"/>
+              </w:rPr>
+              <w:t>. Navigate to and import the previously created ‘survey’ polygon.</w:t>
+            </w:r>
+          </w:p>
+        </w:tc>
+        <w:tc>
+          <w:tcPr>
+            <w:tcW w:w="5225" w:type="dxa"/>
+          </w:tcPr>
+          <w:p>
+            <w:pPr>
+              <w:spacing w:after="120" w:line="288" w:lineRule="auto"/>
+              <w:rPr>
+                <w:rFonts w:ascii="Arial" w:hAnsi="Arial" w:cs="Arial"/>
+              </w:rPr>
+            </w:pPr>
+            <w:r>
+              <w:rPr>
+                <w:rFonts w:ascii="Arial" w:hAnsi="Arial" w:cs="Arial"/>
+              </w:rPr>
+              <w:drawing>
+                <wp:inline distT="0" distB="0" distL="0" distR="0" wp14:anchorId="3C6D04AD" wp14:editId="3D5944CE">
+                  <wp:extent cx="2940201" cy="558829"/>
+                  <wp:effectExtent l="0" t="0" r="0" b="0"/>
+                  <wp:docPr id="2042607793" name="Picture 1"/>
+                  <wp:cNvGraphicFramePr>
+                    <a:graphicFrameLocks xmlns:a="http://schemas.openxmlformats.org/drawingml/2006/main" noChangeAspect="1"/>
+                  </wp:cNvGraphicFramePr>
+                  <a:graphic xmlns:a="http://schemas.openxmlformats.org/drawingml/2006/main">
+                    <a:graphicData uri="http://schemas.openxmlformats.org/drawingml/2006/picture">
+                      <pic:pic xmlns:pic="http://schemas.openxmlformats.org/drawingml/2006/picture">
+                        <pic:nvPicPr>
+                          <pic:cNvPr id="2042607793" name=""/>
+                          <pic:cNvPicPr/>
+                        </pic:nvPicPr>
+                        <pic:blipFill>
+                          <a:blip r:embed="rId22"/>
+                          <a:stretch>
+                            <a:fillRect/>
+                          </a:stretch>
+                        </pic:blipFill>
+                        <pic:spPr>
+                          <a:xfrm>
+                            <a:off x="0" y="0"/>
+                            <a:ext cx="2940201" cy="558829"/>
+                          </a:xfrm>
+                          <a:prstGeom prst="rect">
+                            <a:avLst/>
+                          </a:prstGeom>
+                        </pic:spPr>
+                      </pic:pic>
+                    </a:graphicData>
+                  </a:graphic>
+                </wp:inline>
+              </w:drawing>
+            </w:r>
+          </w:p>
+        </w:tc>
+      </w:tr>
+      <w:tr>
+        <w:tc>
+          <w:tcPr>
+            <w:tcW w:w="5225" w:type="dxa"/>
+          </w:tcPr>
+          <w:p>
+            <w:pPr>
+              <w:pStyle w:val="ListParagraph"/>
+              <w:numPr>
+                <w:ilvl w:val="1"/>
+                <w:numId w:val="1"/>
+              </w:numPr>
+              <w:spacing w:after="120" w:line="288" w:lineRule="auto"/>
+              <w:rPr>
+                <w:rFonts w:ascii="Arial" w:hAnsi="Arial" w:cs="Arial"/>
+              </w:rPr>
+            </w:pPr>
+            <w:r>
+              <w:rPr>
+                <w:rFonts w:ascii="Arial" w:hAnsi="Arial" w:cs="Arial"/>
+              </w:rPr>
+              <w:t>Ensure the angle is as close to 0 or 180</w:t>
+            </w:r>
+            <w:r>
+              <w:rPr>
+                <w:rFonts w:ascii="Arial" w:hAnsi="Arial" w:cs="Arial"/>
+              </w:rPr>
+              <w:t xml:space="preserve"> as possible.  As a North-South flight direction is </w:t>
+            </w:r>
+            <w:r>
+              <w:rPr>
+                <w:rFonts w:ascii="Arial" w:hAnsi="Arial" w:cs="Arial"/>
+              </w:rPr>
+              <w:t xml:space="preserve">preferred for hyperspectral data capture. </w:t>
+            </w:r>
+          </w:p>
+        </w:tc>
+        <w:tc>
+          <w:tcPr>
+            <w:tcW w:w="5225" w:type="dxa"/>
+          </w:tcPr>
+          <w:p>
+            <w:pPr>
+              <w:spacing w:after="120" w:line="288" w:lineRule="auto"/>
+              <w:rPr>
+                <w:rFonts w:ascii="Arial" w:hAnsi="Arial" w:cs="Arial"/>
+              </w:rPr>
+            </w:pPr>
+            <w:r>
+              <w:rPr>
+                <w:rFonts w:ascii="Arial" w:hAnsi="Arial" w:cs="Arial"/>
+              </w:rPr>
+              <w:drawing>
+                <wp:inline distT="0" distB="0" distL="0" distR="0" wp14:anchorId="1A5F3489" wp14:editId="516F2CCE">
+                  <wp:extent cx="1701887" cy="654084"/>
+                  <wp:effectExtent l="0" t="0" r="0" b="0"/>
+                  <wp:docPr id="1297766117" name="Picture 1"/>
+                  <wp:cNvGraphicFramePr>
+                    <a:graphicFrameLocks xmlns:a="http://schemas.openxmlformats.org/drawingml/2006/main" noChangeAspect="1"/>
+                  </wp:cNvGraphicFramePr>
+                  <a:graphic xmlns:a="http://schemas.openxmlformats.org/drawingml/2006/main">
+                    <a:graphicData uri="http://schemas.openxmlformats.org/drawingml/2006/picture">
+                      <pic:pic xmlns:pic="http://schemas.openxmlformats.org/drawingml/2006/picture">
+                        <pic:nvPicPr>
+                          <pic:cNvPr id="1297766117" name=""/>
+                          <pic:cNvPicPr/>
+                        </pic:nvPicPr>
+                        <pic:blipFill>
+                          <a:blip r:embed="rId23"/>
+                          <a:stretch>
+                            <a:fillRect/>
+                          </a:stretch>
+                        </pic:blipFill>
+                        <pic:spPr>
+                          <a:xfrm>
+                            <a:off x="0" y="0"/>
+                            <a:ext cx="1701887" cy="654084"/>
+                          </a:xfrm>
+                          <a:prstGeom prst="rect">
+                            <a:avLst/>
+                          </a:prstGeom>
+                        </pic:spPr>
+                      </pic:pic>
+                    </a:graphicData>
+                  </a:graphic>
+                </wp:inline>
+              </w:drawing>
+            </w:r>
+          </w:p>
+          <w:p>
+            <w:pPr>
+              <w:spacing w:after="120" w:line="288" w:lineRule="auto"/>
+              <w:rPr>
+                <w:rFonts w:ascii="Arial" w:hAnsi="Arial" w:cs="Arial"/>
+              </w:rPr>
+            </w:pPr>
+            <w:r>
+              <w:rPr>
+                <w:rFonts w:ascii="Arial" w:hAnsi="Arial" w:cs="Arial"/>
+              </w:rPr>
+              <w:drawing>
+                <wp:inline distT="0" distB="0" distL="0" distR="0" wp14:anchorId="43BC3921" wp14:editId="26E87AFC">
+                  <wp:extent cx="1663786" cy="666784"/>
+                  <wp:effectExtent l="0" t="0" r="0" b="0"/>
+                  <wp:docPr id="848346559" name="Picture 1"/>
+                  <wp:cNvGraphicFramePr>
+                    <a:graphicFrameLocks xmlns:a="http://schemas.openxmlformats.org/drawingml/2006/main" noChangeAspect="1"/>
+                  </wp:cNvGraphicFramePr>
+                  <a:graphic xmlns:a="http://schemas.openxmlformats.org/drawingml/2006/main">
+                    <a:graphicData uri="http://schemas.openxmlformats.org/drawingml/2006/picture">
+                      <pic:pic xmlns:pic="http://schemas.openxmlformats.org/drawingml/2006/picture">
+                        <pic:nvPicPr>
+                          <pic:cNvPr id="848346559" name=""/>
+                          <pic:cNvPicPr/>
+                        </pic:nvPicPr>
+                        <pic:blipFill>
+                          <a:blip r:embed="rId24"/>
+                          <a:stretch>
+                            <a:fillRect/>
+                          </a:stretch>
+                        </pic:blipFill>
+                        <pic:spPr>
+                          <a:xfrm>
+                            <a:off x="0" y="0"/>
+                            <a:ext cx="1663786" cy="666784"/>
+                          </a:xfrm>
+                          <a:prstGeom prst="rect">
+                            <a:avLst/>
+                          </a:prstGeom>
+                        </pic:spPr>
+                      </pic:pic>
+                    </a:graphicData>
+                  </a:graphic>
+                </wp:inline>
+              </w:drawing>
+            </w:r>
+          </w:p>
+        </w:tc>
+      </w:tr>
+    </w:tbl>
+    <w:p>
+      <w:pPr>
+        <w:spacing w:after="120" w:line="288" w:lineRule="auto"/>
+        <w:rPr>
+          <w:rFonts w:ascii="Arial" w:hAnsi="Arial" w:cs="Arial"/>
+        </w:rPr>
+      </w:pPr>
+    </w:p>
+    <w:p>
+      <w:pPr>
+        <w:pStyle w:val="ListParagraph"/>
+        <w:numPr>
+          <w:ilvl w:val="0"/>
+          <w:numId w:val="1"/>
+        </w:numPr>
+        <w:spacing w:after="120" w:line="288" w:lineRule="auto"/>
+        <w:ind w:hanging="357"/>
+        <w:contextualSpacing w:val="0"/>
+        <w:rPr>
+          <w:rFonts w:ascii="Arial" w:hAnsi="Arial" w:cs="Arial"/>
+        </w:rPr>
+      </w:pPr>
+      <w:r>
+        <w:rPr>
+          <w:rFonts w:ascii="Arial" w:hAnsi="Arial" w:cs="Arial"/>
+        </w:rPr>
         <w:t>Using both QGroundControl</w:t>
       </w:r>
       <w:r>
@@ -1837,14 +2791,14 @@
         </w:rPr>
         <w:t>Ensuring that the frame period is at a minimum 20% ove</w:t>
       </w:r>
-      <w:commentRangeStart w:id="12"/>
+      <w:commentRangeStart w:id="10"/>
       <w:r>
         <w:rPr>
           <w:rFonts w:ascii="Arial" w:hAnsi="Arial" w:cs="Arial"/>
         </w:rPr>
         <w:t>rsampling, the side over</w:t>
       </w:r>
-      <w:commentRangeEnd w:id="12"/>
+      <w:commentRangeEnd w:id="10"/>
       <w:r>
         <w:rPr>
           <w:rStyle w:val="CommentReference"/>
@@ -1852,7 +2806,7 @@
           <w:sz w:val="22"/>
           <w:szCs w:val="22"/>
         </w:rPr>
-        <w:commentReference w:id="12"/>
+        <w:commentReference w:id="10"/>
       </w:r>
       <w:r>
         <w:rPr>
@@ -1872,8 +2826,8 @@
         </w:rPr>
         <w:t xml:space="preserve">, and the ‘turnaround distance’ is 2x flight-speed (&gt;3x at &gt;6m/s).   </w:t>
       </w:r>
-      <w:commentRangeStart w:id="13"/>
-      <w:commentRangeEnd w:id="13"/>
+      <w:commentRangeStart w:id="11"/>
+      <w:commentRangeEnd w:id="11"/>
       <w:r>
         <w:rPr>
           <w:rStyle w:val="CommentReference"/>
@@ -1881,7 +2835,7 @@
           <w:sz w:val="22"/>
           <w:szCs w:val="22"/>
         </w:rPr>
-        <w:commentReference w:id="13"/>
+        <w:commentReference w:id="11"/>
       </w:r>
     </w:p>
     <w:p>
@@ -1896,53 +2850,172 @@
         <w:contextualSpacing w:val="0"/>
         <w:rPr>
           <w:rFonts w:ascii="Arial" w:hAnsi="Arial" w:cs="Arial"/>
-        </w:rPr>
-      </w:pPr>
-      <w:r>
-        <w:rPr>
-          <w:rFonts w:ascii="Arial" w:hAnsi="Arial" w:cs="Arial"/>
+          <w:highlight w:val="yellow"/>
+        </w:rPr>
+      </w:pPr>
+      <w:r>
+        <w:rPr>
+          <w:rFonts w:ascii="Arial" w:hAnsi="Arial" w:cs="Arial"/>
+          <w:highlight w:val="yellow"/>
         </w:rPr>
         <w:t xml:space="preserve">Ensure </w:t>
       </w:r>
-      <w:commentRangeStart w:id="14"/>
-      <w:r>
-        <w:rPr>
-          <w:rFonts w:ascii="Arial" w:hAnsi="Arial" w:cs="Arial"/>
+      <w:commentRangeStart w:id="12"/>
+      <w:r>
+        <w:rPr>
+          <w:rFonts w:ascii="Arial" w:hAnsi="Arial" w:cs="Arial"/>
+          <w:highlight w:val="yellow"/>
         </w:rPr>
         <w:t>flight lines are in the direction of planting</w:t>
       </w:r>
       <w:r>
         <w:rPr>
           <w:rFonts w:ascii="Arial" w:hAnsi="Arial" w:cs="Arial"/>
-        </w:rPr>
-        <w:t xml:space="preserve"> (GRYFN)</w:t>
-      </w:r>
-      <w:commentRangeEnd w:id="14"/>
+          <w:highlight w:val="yellow"/>
+        </w:rPr>
+        <w:t xml:space="preserve"> (</w:t>
+      </w:r>
+      <w:commentRangeStart w:id="13"/>
+      <w:r>
+        <w:rPr>
+          <w:rFonts w:ascii="Arial" w:hAnsi="Arial" w:cs="Arial"/>
+          <w:highlight w:val="yellow"/>
+        </w:rPr>
+        <w:t>GRYFN</w:t>
+      </w:r>
+      <w:commentRangeEnd w:id="13"/>
       <w:r>
         <w:rPr>
           <w:rStyle w:val="CommentReference"/>
           <w:rFonts w:ascii="Arial" w:hAnsi="Arial" w:cs="Arial"/>
           <w:sz w:val="22"/>
           <w:szCs w:val="22"/>
-        </w:rPr>
-        <w:commentReference w:id="14"/>
-      </w:r>
-      <w:r>
-        <w:rPr>
-          <w:rFonts w:ascii="Arial" w:hAnsi="Arial" w:cs="Arial"/>
-        </w:rPr>
-        <w:t>.</w:t>
-      </w:r>
-      <w:commentRangeStart w:id="15"/>
-      <w:commentRangeEnd w:id="15"/>
+          <w:highlight w:val="yellow"/>
+        </w:rPr>
+        <w:commentReference w:id="13"/>
+      </w:r>
+      <w:r>
+        <w:rPr>
+          <w:rFonts w:ascii="Arial" w:hAnsi="Arial" w:cs="Arial"/>
+          <w:highlight w:val="yellow"/>
+        </w:rPr>
+        <w:t>)</w:t>
+      </w:r>
+      <w:commentRangeEnd w:id="12"/>
       <w:r>
         <w:rPr>
           <w:rStyle w:val="CommentReference"/>
           <w:rFonts w:ascii="Arial" w:hAnsi="Arial" w:cs="Arial"/>
           <w:sz w:val="22"/>
           <w:szCs w:val="22"/>
-        </w:rPr>
-        <w:commentReference w:id="15"/>
+          <w:highlight w:val="yellow"/>
+        </w:rPr>
+        <w:commentReference w:id="12"/>
+      </w:r>
+      <w:r>
+        <w:rPr>
+          <w:rFonts w:ascii="Arial" w:hAnsi="Arial" w:cs="Arial"/>
+          <w:highlight w:val="yellow"/>
+        </w:rPr>
+        <w:t>.</w:t>
+      </w:r>
+    </w:p>
+    <w:p>
+      <w:pPr>
+        <w:pStyle w:val="ListParagraph"/>
+        <w:numPr>
+          <w:ilvl w:val="0"/>
+          <w:numId w:val="1"/>
+        </w:numPr>
+        <w:spacing w:after="120" w:line="288" w:lineRule="auto"/>
+        <w:ind w:hanging="357"/>
+        <w:contextualSpacing w:val="0"/>
+        <w:rPr>
+          <w:rFonts w:ascii="Arial" w:hAnsi="Arial" w:cs="Arial"/>
+        </w:rPr>
+      </w:pPr>
+      <w:r>
+        <w:rPr>
+          <w:rFonts w:ascii="Arial" w:hAnsi="Arial" w:cs="Arial"/>
+        </w:rPr>
+        <w:t xml:space="preserve">Once flight plan is complete.  Upload to the </w:t>
+      </w:r>
+      <w:r>
+        <w:rPr>
+          <w:rFonts w:ascii="Arial" w:hAnsi="Arial" w:cs="Arial"/>
+        </w:rPr>
+        <w:t>UAV</w:t>
+      </w:r>
+      <w:r>
+        <w:rPr>
+          <w:rFonts w:ascii="Arial" w:hAnsi="Arial" w:cs="Arial"/>
+        </w:rPr>
+        <w:t xml:space="preserve"> using the </w:t>
+      </w:r>
+      <w:r>
+        <w:rPr>
+          <w:rFonts w:ascii="Arial" w:hAnsi="Arial" w:cs="Arial"/>
+        </w:rPr>
+        <w:t xml:space="preserve">wired connection from PC to IF1200. </w:t>
+      </w:r>
+      <w:r>
+        <w:rPr>
+          <w:rFonts w:ascii="Arial" w:hAnsi="Arial" w:cs="Arial"/>
+        </w:rPr>
+        <w:t xml:space="preserve">Once UAV is powered and connected to RC then the mission will appear on RC.  If mission doesn’t appear on RC. Navigate to </w:t>
+      </w:r>
+      <w:r>
+        <w:rPr>
+          <w:rFonts w:ascii="Arial" w:hAnsi="Arial" w:cs="Arial"/>
+        </w:rPr>
+        <w:t>‘</w:t>
+      </w:r>
+      <w:r>
+        <w:rPr>
+          <w:rFonts w:ascii="Arial" w:hAnsi="Arial" w:cs="Arial"/>
+        </w:rPr>
+        <w:t>F</w:t>
+      </w:r>
+      <w:r>
+        <w:rPr>
+          <w:rFonts w:ascii="Arial" w:hAnsi="Arial" w:cs="Arial"/>
+        </w:rPr>
+        <w:t xml:space="preserve">light </w:t>
+      </w:r>
+      <w:r>
+        <w:rPr>
+          <w:rFonts w:ascii="Arial" w:hAnsi="Arial" w:cs="Arial"/>
+        </w:rPr>
+        <w:t>P</w:t>
+      </w:r>
+      <w:r>
+        <w:rPr>
+          <w:rFonts w:ascii="Arial" w:hAnsi="Arial" w:cs="Arial"/>
+        </w:rPr>
+        <w:t xml:space="preserve">lanning’ &gt; </w:t>
+      </w:r>
+      <w:r>
+        <w:rPr>
+          <w:rFonts w:ascii="Arial" w:hAnsi="Arial" w:cs="Arial"/>
+        </w:rPr>
+        <w:t>‘File’</w:t>
+      </w:r>
+      <w:r>
+        <w:rPr>
+          <w:rFonts w:ascii="Arial" w:hAnsi="Arial" w:cs="Arial"/>
+        </w:rPr>
+        <w:t xml:space="preserve"> &gt; ‘Vehicle’ &gt; ‘Download’. </w:t>
+      </w:r>
+      <w:commentRangeStart w:id="14"/>
+      <w:commentRangeEnd w:id="14"/>
+      <w:r>
+        <w:rPr>
+          <w:rStyle w:val="CommentReference"/>
+          <w:rFonts w:ascii="Arial" w:hAnsi="Arial" w:cs="Arial"/>
+          <w:sz w:val="22"/>
+          <w:szCs w:val="22"/>
+        </w:rPr>
+        <w:commentReference w:id="14"/>
       </w:r>
     </w:p>
     <w:p>
@@ -1977,8 +3050,8 @@
         </w:rPr>
         <w:t xml:space="preserve">ONSITE </w:t>
       </w:r>
+      <w:commentRangeStart w:id="15"/>
       <w:commentRangeStart w:id="16"/>
-      <w:commentRangeStart w:id="17"/>
       <w:r>
         <w:rPr>
           <w:rFonts w:ascii="Arial" w:hAnsi="Arial" w:cs="Arial"/>
@@ -1988,7 +3061,7 @@
         </w:rPr>
         <w:t>PREFLIGHT</w:t>
       </w:r>
-      <w:commentRangeEnd w:id="16"/>
+      <w:commentRangeEnd w:id="15"/>
       <w:r>
         <w:rPr>
           <w:rStyle w:val="CommentReference"/>
@@ -1998,9 +3071,9 @@
           <w:sz w:val="32"/>
           <w:szCs w:val="22"/>
         </w:rPr>
-        <w:commentReference w:id="16"/>
-      </w:r>
-      <w:commentRangeEnd w:id="17"/>
+        <w:commentReference w:id="15"/>
+      </w:r>
+      <w:commentRangeEnd w:id="16"/>
       <w:r>
         <w:rPr>
           <w:rStyle w:val="CommentReference"/>
@@ -2010,7 +3083,7 @@
           <w:sz w:val="32"/>
           <w:szCs w:val="22"/>
         </w:rPr>
-        <w:commentReference w:id="17"/>
+        <w:commentReference w:id="16"/>
       </w:r>
       <w:r>
         <w:rPr>
@@ -2081,20 +3154,55 @@
         <w:rPr>
           <w:rFonts w:ascii="Arial" w:hAnsi="Arial" w:cs="Arial"/>
         </w:rPr>
+        <w:t xml:space="preserve"> for quality hyperspectral</w:t>
+      </w:r>
+      <w:r>
+        <w:rPr>
+          <w:rFonts w:ascii="Arial" w:hAnsi="Arial" w:cs="Arial"/>
+        </w:rPr>
+        <w:t xml:space="preserve"> capture is</w:t>
+      </w:r>
+      <w:r>
+        <w:rPr>
+          <w:rFonts w:ascii="Arial" w:hAnsi="Arial" w:cs="Arial"/>
+        </w:rPr>
         <w:t xml:space="preserve"> </w:t>
       </w:r>
       <w:r>
         <w:rPr>
           <w:rFonts w:ascii="Arial" w:hAnsi="Arial" w:cs="Arial"/>
-          <w:shd w:val="clear" w:color="auto" w:fill="FFFF00"/>
-        </w:rPr>
-        <w:t>15 km/h</w:t>
-      </w:r>
-      <w:r>
-        <w:rPr>
-          <w:rFonts w:ascii="Arial" w:hAnsi="Arial" w:cs="Arial"/>
-        </w:rPr>
-        <w:t xml:space="preserve">? </w:t>
+        </w:rPr>
+        <w:t xml:space="preserve">6m/s </w:t>
+      </w:r>
+      <w:r>
+        <w:rPr>
+          <w:rFonts w:ascii="Arial" w:hAnsi="Arial" w:cs="Arial"/>
+        </w:rPr>
+        <w:t>or 22km/hr.</w:t>
+      </w:r>
+      <w:r>
+        <w:rPr>
+          <w:rFonts w:ascii="Arial" w:hAnsi="Arial" w:cs="Arial"/>
+        </w:rPr>
+        <w:t xml:space="preserve"> Any windspeed over 5m/s or </w:t>
+      </w:r>
+      <w:r>
+        <w:rPr>
+          <w:rFonts w:ascii="Arial" w:hAnsi="Arial" w:cs="Arial"/>
+        </w:rPr>
+        <w:t xml:space="preserve">18km/hr </w:t>
+      </w:r>
+      <w:r>
+        <w:rPr>
+          <w:rFonts w:ascii="Arial" w:hAnsi="Arial" w:cs="Arial"/>
+        </w:rPr>
+        <w:t>should be recorded</w:t>
+      </w:r>
+      <w:r>
+        <w:rPr>
+          <w:rFonts w:ascii="Arial" w:hAnsi="Arial" w:cs="Arial"/>
+        </w:rPr>
+        <w:t>.</w:t>
       </w:r>
       <w:r>
         <w:rPr>
@@ -2106,11 +3214,17 @@
         <w:rPr>
           <w:rFonts w:ascii="Arial" w:hAnsi="Arial" w:cs="Arial"/>
         </w:rPr>
+        <w:t xml:space="preserve"> </w:t>
+      </w:r>
+      <w:r>
+        <w:rPr>
+          <w:rFonts w:ascii="Arial" w:hAnsi="Arial" w:cs="Arial"/>
+        </w:rPr>
         <w:t>Try to e</w:t>
       </w:r>
+      <w:commentRangeStart w:id="17"/>
       <w:commentRangeStart w:id="18"/>
       <w:commentRangeStart w:id="19"/>
-      <w:commentRangeStart w:id="20"/>
       <w:r>
         <w:rPr>
           <w:rFonts w:ascii="Arial" w:hAnsi="Arial" w:cs="Arial"/>
@@ -2141,7 +3255,7 @@
         </w:rPr>
         <w:t>of solar noon</w:t>
       </w:r>
-      <w:commentRangeEnd w:id="18"/>
+      <w:commentRangeEnd w:id="17"/>
       <w:r>
         <w:rPr>
           <w:rStyle w:val="CommentReference"/>
@@ -2149,9 +3263,9 @@
           <w:sz w:val="22"/>
           <w:szCs w:val="22"/>
         </w:rPr>
-        <w:commentReference w:id="18"/>
-      </w:r>
-      <w:commentRangeEnd w:id="19"/>
+        <w:commentReference w:id="17"/>
+      </w:r>
+      <w:commentRangeEnd w:id="18"/>
       <w:r>
         <w:rPr>
           <w:rStyle w:val="CommentReference"/>
@@ -2159,9 +3273,9 @@
           <w:sz w:val="22"/>
           <w:szCs w:val="22"/>
         </w:rPr>
-        <w:commentReference w:id="19"/>
-      </w:r>
-      <w:commentRangeEnd w:id="20"/>
+        <w:commentReference w:id="18"/>
+      </w:r>
+      <w:commentRangeEnd w:id="19"/>
       <w:r>
         <w:rPr>
           <w:rStyle w:val="CommentReference"/>
@@ -2169,7 +3283,7 @@
           <w:sz w:val="22"/>
           <w:szCs w:val="22"/>
         </w:rPr>
-        <w:commentReference w:id="20"/>
+        <w:commentReference w:id="19"/>
       </w:r>
       <w:r>
         <w:rPr>
@@ -2223,7 +3337,7 @@
         </w:rPr>
         <w:t xml:space="preserve">this will depend upon time of year and latitude so please check </w:t>
       </w:r>
-      <w:hyperlink r:id="rId17" w:history="1">
+      <w:hyperlink r:id="rId25" w:history="1">
         <w:r>
           <w:rPr>
             <w:rStyle w:val="Hyperlink"/>
@@ -2253,89 +3367,6 @@
       <w:pPr>
         <w:pStyle w:val="ListParagraph"/>
         <w:numPr>
-          <w:ilvl w:val="1"/>
-          <w:numId w:val="14"/>
-        </w:numPr>
-        <w:spacing w:after="40" w:line="240" w:lineRule="auto"/>
-        <w:ind w:hanging="357"/>
-        <w:contextualSpacing w:val="0"/>
-        <w:rPr>
-          <w:rFonts w:ascii="Arial" w:hAnsi="Arial" w:cs="Arial"/>
-        </w:rPr>
-      </w:pPr>
-      <w:r>
-        <w:rPr>
-          <w:rFonts w:ascii="Arial" w:hAnsi="Arial" w:cs="Arial"/>
-        </w:rPr>
-        <w:t>Set up the Emlid RTK (install a peg for recurring flights)</w:t>
-      </w:r>
-      <w:r>
-        <w:rPr>
-          <w:rFonts w:ascii="Arial" w:hAnsi="Arial" w:cs="Arial"/>
-        </w:rPr>
-        <w:t>, l</w:t>
-      </w:r>
-      <w:r>
-        <w:rPr>
-          <w:rFonts w:ascii="Arial" w:hAnsi="Arial" w:cs="Arial"/>
-        </w:rPr>
-        <w:t>et it run for at least 15 minutes</w:t>
-      </w:r>
-      <w:r>
-        <w:rPr>
-          <w:rFonts w:ascii="Arial" w:hAnsi="Arial" w:cs="Arial"/>
-        </w:rPr>
-        <w:t>,</w:t>
-      </w:r>
-      <w:r>
-        <w:rPr>
-          <w:rFonts w:ascii="Arial" w:hAnsi="Arial" w:cs="Arial"/>
-        </w:rPr>
-        <w:t xml:space="preserve"> and s</w:t>
-      </w:r>
-      <w:r>
-        <w:rPr>
-          <w:rFonts w:ascii="Arial" w:hAnsi="Arial" w:cs="Arial"/>
-        </w:rPr>
-        <w:t>tart recording the RINEX file</w:t>
-      </w:r>
-      <w:r>
-        <w:rPr>
-          <w:rFonts w:ascii="Arial" w:hAnsi="Arial" w:cs="Arial"/>
-        </w:rPr>
-        <w:t>, before flying</w:t>
-      </w:r>
-      <w:r>
-        <w:rPr>
-          <w:rFonts w:ascii="Arial" w:hAnsi="Arial" w:cs="Arial"/>
-        </w:rPr>
-        <w:t xml:space="preserve"> (</w:t>
-      </w:r>
-      <w:r>
-        <w:rPr>
-          <w:rFonts w:ascii="Arial" w:hAnsi="Arial" w:cs="Arial"/>
-          <w:i/>
-          <w:iCs/>
-        </w:rPr>
-        <w:t>OPTIONAL</w:t>
-      </w:r>
-      <w:r>
-        <w:rPr>
-          <w:rFonts w:ascii="Arial" w:hAnsi="Arial" w:cs="Arial"/>
-        </w:rPr>
-        <w:t>).</w:t>
-      </w:r>
-      <w:r>
-        <w:rPr>
-          <w:rFonts w:ascii="Arial" w:hAnsi="Arial" w:cs="Arial"/>
-        </w:rPr>
-        <w:t xml:space="preserve"> </w:t>
-      </w:r>
-    </w:p>
-    <w:p>
-      <w:pPr>
-        <w:pStyle w:val="ListParagraph"/>
-        <w:numPr>
           <w:ilvl w:val="0"/>
           <w:numId w:val="15"/>
         </w:numPr>
@@ -2379,7 +3410,7 @@
         </w:rPr>
         <w:t xml:space="preserve"> (find in </w:t>
       </w:r>
-      <w:hyperlink r:id="rId18" w:history="1">
+      <w:hyperlink r:id="rId26" w:history="1">
         <w:r>
           <w:rPr>
             <w:rStyle w:val="Hyperlink"/>
@@ -2445,7 +3476,7 @@
         </w:rPr>
         <w:t xml:space="preserve"> </w:t>
       </w:r>
-      <w:commentRangeStart w:id="21"/>
+      <w:commentRangeStart w:id="20"/>
       <w:r>
         <w:rPr>
           <w:rFonts w:ascii="Arial" w:hAnsi="Arial" w:cs="Arial"/>
@@ -2464,7 +3495,7 @@
         </w:rPr>
         <w:t>to ensure geometric calibration</w:t>
       </w:r>
-      <w:commentRangeEnd w:id="21"/>
+      <w:commentRangeEnd w:id="20"/>
       <w:r>
         <w:rPr>
           <w:rStyle w:val="CommentReference"/>
@@ -2472,7 +3503,7 @@
           <w:sz w:val="22"/>
           <w:szCs w:val="22"/>
         </w:rPr>
-        <w:commentReference w:id="21"/>
+        <w:commentReference w:id="20"/>
       </w:r>
       <w:r>
         <w:rPr>
@@ -2694,7 +3725,6 @@
         <w:rPr>
           <w:rFonts w:ascii="Arial" w:hAnsi="Arial" w:cs="Arial"/>
         </w:rPr>
-        <w:lastRenderedPageBreak/>
         <w:t xml:space="preserve">When using two panels, </w:t>
       </w:r>
       <w:r>
@@ -2844,14 +3874,6 @@
         </w:rPr>
         <w:t xml:space="preserve"> </w:t>
       </w:r>
-    </w:p>
-    <w:p>
-      <w:pPr>
-        <w:spacing w:after="40" w:line="240" w:lineRule="auto"/>
-        <w:rPr>
-          <w:rFonts w:ascii="Arial" w:hAnsi="Arial" w:cs="Arial"/>
-        </w:rPr>
-      </w:pPr>
     </w:p>
     <w:p>
       <w:pPr>
@@ -2878,7 +3900,7 @@
                     <pic:cNvPicPr/>
                   </pic:nvPicPr>
                   <pic:blipFill>
-                    <a:blip r:embed="rId19">
+                    <a:blip r:embed="rId27">
                       <a:extLst>
                         <a:ext uri="{28A0092B-C50C-407E-A947-70E740481C1C}">
                           <a14:useLocalDpi xmlns:a14="http://schemas.microsoft.com/office/drawing/2010/main"/>
@@ -2907,18 +3929,6 @@
     </w:p>
     <w:p>
       <w:pPr>
-        <w:spacing w:after="40" w:line="240" w:lineRule="auto"/>
-        <w:jc w:val="center"/>
-      </w:pPr>
-    </w:p>
-    <w:p>
-      <w:pPr>
-        <w:spacing w:after="40" w:line="240" w:lineRule="auto"/>
-        <w:jc w:val="center"/>
-      </w:pPr>
-    </w:p>
-    <w:p>
-      <w:pPr>
         <w:pStyle w:val="ListParagraph"/>
         <w:numPr>
           <w:ilvl w:val="0"/>
@@ -3191,7 +4201,7 @@
         </w:rPr>
         <w:t xml:space="preserve">, </w:t>
       </w:r>
-      <w:hyperlink r:id="rId20" w:history="1">
+      <w:hyperlink r:id="rId28" w:history="1">
         <w:r>
           <w:rPr>
             <w:rStyle w:val="Hyperlink"/>
@@ -3386,8 +4396,8 @@
           <w:rFonts w:ascii="Arial" w:hAnsi="Arial" w:cs="Arial"/>
         </w:rPr>
       </w:pPr>
+      <w:commentRangeStart w:id="21"/>
       <w:commentRangeStart w:id="22"/>
-      <w:commentRangeStart w:id="23"/>
       <w:r>
         <w:rPr>
           <w:rFonts w:ascii="Arial" w:hAnsi="Arial" w:cs="Arial"/>
@@ -3418,7 +4428,7 @@
         </w:rPr>
         <w:t>GNSS antenna cable.</w:t>
       </w:r>
-      <w:commentRangeEnd w:id="22"/>
+      <w:commentRangeEnd w:id="21"/>
       <w:r>
         <w:rPr>
           <w:rStyle w:val="CommentReference"/>
@@ -3426,9 +4436,9 @@
           <w:sz w:val="22"/>
           <w:szCs w:val="22"/>
         </w:rPr>
-        <w:commentReference w:id="22"/>
-      </w:r>
-      <w:commentRangeEnd w:id="23"/>
+        <w:commentReference w:id="21"/>
+      </w:r>
+      <w:commentRangeEnd w:id="22"/>
       <w:r>
         <w:rPr>
           <w:rStyle w:val="CommentReference"/>
@@ -3436,7 +4446,7 @@
           <w:sz w:val="22"/>
           <w:szCs w:val="22"/>
         </w:rPr>
-        <w:commentReference w:id="23"/>
+        <w:commentReference w:id="22"/>
       </w:r>
     </w:p>
     <w:p>
@@ -3513,7 +4523,7 @@
         </w:rPr>
         <w:t xml:space="preserve"> </w:t>
       </w:r>
-      <w:hyperlink r:id="rId21">
+      <w:hyperlink r:id="rId29">
         <w:r>
           <w:rPr>
             <w:rStyle w:val="Hyperlink"/>
@@ -3601,7 +4611,6 @@
         <w:rPr>
           <w:rFonts w:ascii="Arial" w:hAnsi="Arial" w:cs="Arial"/>
         </w:rPr>
-        <w:lastRenderedPageBreak/>
         <w:t>Check radio controller/ground control battery status.</w:t>
       </w:r>
     </w:p>
@@ -3769,35 +4778,6 @@
     </w:p>
     <w:p>
       <w:pPr>
-        <w:pStyle w:val="ListParagraph"/>
-        <w:numPr>
-          <w:ilvl w:val="0"/>
-          <w:numId w:val="15"/>
-        </w:numPr>
-        <w:spacing w:after="40" w:line="240" w:lineRule="auto"/>
-        <w:ind w:hanging="357"/>
-        <w:contextualSpacing w:val="0"/>
-        <w:rPr>
-          <w:rFonts w:ascii="Arial" w:hAnsi="Arial" w:cs="Arial"/>
-        </w:rPr>
-      </w:pPr>
-      <w:r>
-        <w:rPr>
-          <w:rFonts w:ascii="Arial" w:hAnsi="Arial" w:cs="Arial"/>
-        </w:rPr>
-        <w:t>Upload flight plan to aircraft.</w:t>
-      </w:r>
-    </w:p>
-    <w:p>
-      <w:pPr>
-        <w:spacing w:after="40" w:line="240" w:lineRule="auto"/>
-        <w:rPr>
-          <w:rFonts w:ascii="Arial" w:hAnsi="Arial" w:cs="Arial"/>
-        </w:rPr>
-      </w:pPr>
-    </w:p>
-    <w:p>
-      <w:pPr>
         <w:pBdr>
           <w:top w:val="single" w:sz="12" w:space="1" w:color="auto"/>
           <w:bottom w:val="single" w:sz="12" w:space="1" w:color="auto"/>
@@ -3820,20 +4800,30 @@
           <w:sz w:val="32"/>
           <w:szCs w:val="32"/>
         </w:rPr>
-        <w:t>SENSOR CONFIGURATION — Hyperspec III (VNIR + SWIR)</w:t>
-      </w:r>
-      <w:commentRangeStart w:id="24"/>
-      <w:commentRangeEnd w:id="24"/>
-      <w:r>
-        <w:rPr>
-          <w:rStyle w:val="CommentReference"/>
+        <w:t xml:space="preserve">CALViS </w:t>
+      </w:r>
+      <w:r>
+        <w:rPr>
           <w:rFonts w:ascii="Arial" w:hAnsi="Arial" w:cs="Arial"/>
           <w:b/>
           <w:color w:val="6F901E"/>
           <w:sz w:val="32"/>
           <w:szCs w:val="32"/>
         </w:rPr>
-        <w:commentReference w:id="24"/>
+        <w:t>SENSOR CONFIGURATION</w:t>
+      </w:r>
+      <w:commentRangeStart w:id="23"/>
+      <w:commentRangeEnd w:id="23"/>
+      <w:r>
+        <w:rPr>
+          <w:rStyle w:val="CommentReference"/>
+          <w:rFonts w:ascii="Arial" w:hAnsi="Arial" w:cs="Arial"/>
+          <w:b/>
+          <w:color w:val="6F901E"/>
+          <w:sz w:val="32"/>
+          <w:szCs w:val="32"/>
+        </w:rPr>
+        <w:commentReference w:id="23"/>
       </w:r>
     </w:p>
     <w:p>
@@ -4005,14 +4995,14 @@
         </w:rPr>
         <w:t xml:space="preserve">Connect dual-ethernet cables to </w:t>
       </w:r>
-      <w:commentRangeStart w:id="25"/>
+      <w:commentRangeStart w:id="24"/>
       <w:r>
         <w:rPr>
           <w:rFonts w:ascii="Arial" w:hAnsi="Arial" w:cs="Arial"/>
         </w:rPr>
         <w:t>VNIR and SWIR ports.</w:t>
       </w:r>
-      <w:commentRangeEnd w:id="25"/>
+      <w:commentRangeEnd w:id="24"/>
       <w:r>
         <w:rPr>
           <w:rStyle w:val="CommentReference"/>
@@ -4020,7 +5010,7 @@
           <w:sz w:val="22"/>
           <w:szCs w:val="22"/>
         </w:rPr>
-        <w:commentReference w:id="25"/>
+        <w:commentReference w:id="24"/>
       </w:r>
     </w:p>
     <w:p>
@@ -4048,73 +5038,90 @@
         <w:spacing w:after="40" w:line="240" w:lineRule="auto"/>
         <w:rPr>
           <w:rFonts w:ascii="Arial" w:hAnsi="Arial" w:cs="Arial"/>
-          <w:highlight w:val="yellow"/>
-        </w:rPr>
-      </w:pPr>
+        </w:rPr>
+      </w:pPr>
+      <w:commentRangeStart w:id="25"/>
       <w:commentRangeStart w:id="26"/>
       <w:commentRangeStart w:id="27"/>
-      <w:commentRangeStart w:id="28"/>
-      <w:r>
-        <w:rPr>
-          <w:rFonts w:ascii="Arial" w:hAnsi="Arial" w:cs="Arial"/>
-          <w:highlight w:val="yellow"/>
-        </w:rPr>
-        <w:t>VNIR – HS Insight –</w:t>
-      </w:r>
-      <w:r>
-        <w:rPr>
-          <w:rFonts w:ascii="Arial" w:hAnsi="Arial" w:cs="Arial"/>
-        </w:rPr>
-        <w:t xml:space="preserve"> </w:t>
-      </w:r>
-    </w:p>
-    <w:p>
-      <w:pPr>
-        <w:spacing w:after="40" w:line="240" w:lineRule="auto"/>
-        <w:rPr>
-          <w:rFonts w:ascii="Arial" w:hAnsi="Arial" w:cs="Arial"/>
-          <w:highlight w:val="yellow"/>
-        </w:rPr>
-      </w:pPr>
-      <w:r>
-        <w:rPr>
-          <w:rFonts w:ascii="Arial" w:hAnsi="Arial" w:cs="Arial"/>
-          <w:highlight w:val="yellow"/>
-        </w:rPr>
-        <w:t>SWIR – Hyperspec III</w:t>
-      </w:r>
-      <w:commentRangeEnd w:id="26"/>
+      <w:r>
+        <w:rPr>
+          <w:rFonts w:ascii="Arial" w:hAnsi="Arial" w:cs="Arial"/>
+        </w:rPr>
+        <w:t xml:space="preserve">HS Insight – </w:t>
+      </w:r>
+      <w:r>
+        <w:rPr>
+          <w:rFonts w:ascii="Arial" w:hAnsi="Arial" w:cs="Arial"/>
+        </w:rPr>
+        <w:t xml:space="preserve">For Version 1 </w:t>
+      </w:r>
+      <w:r>
+        <w:rPr>
+          <w:rFonts w:ascii="Arial" w:hAnsi="Arial" w:cs="Arial"/>
+        </w:rPr>
+        <w:t xml:space="preserve">we will use Hyprspec3 </w:t>
+      </w:r>
+      <w:r>
+        <w:rPr>
+          <w:rFonts w:ascii="Arial" w:hAnsi="Arial" w:cs="Arial"/>
+        </w:rPr>
+        <w:t xml:space="preserve">until issues with HS insight have been addressed. </w:t>
+      </w:r>
+    </w:p>
+    <w:p>
+      <w:pPr>
+        <w:spacing w:after="40" w:line="240" w:lineRule="auto"/>
+        <w:rPr>
+          <w:rFonts w:ascii="Arial" w:hAnsi="Arial" w:cs="Arial"/>
+        </w:rPr>
+      </w:pPr>
+      <w:r>
+        <w:rPr>
+          <w:rFonts w:ascii="Arial" w:hAnsi="Arial" w:cs="Arial"/>
+        </w:rPr>
+        <w:t>SWIR</w:t>
+      </w:r>
+      <w:r>
+        <w:rPr>
+          <w:rFonts w:ascii="Arial" w:hAnsi="Arial" w:cs="Arial"/>
+        </w:rPr>
+        <w:t xml:space="preserve"> + VNIR</w:t>
+      </w:r>
+      <w:r>
+        <w:rPr>
+          <w:rFonts w:ascii="Arial" w:hAnsi="Arial" w:cs="Arial"/>
+        </w:rPr>
+        <w:t xml:space="preserve"> – Hyperspec III</w:t>
+      </w:r>
+      <w:commentRangeEnd w:id="25"/>
       <w:r>
         <w:rPr>
           <w:rStyle w:val="CommentReference"/>
           <w:rFonts w:ascii="Arial" w:hAnsi="Arial" w:cs="Arial"/>
           <w:sz w:val="22"/>
           <w:szCs w:val="22"/>
-          <w:highlight w:val="yellow"/>
-        </w:rPr>
-        <w:commentReference w:id="26"/>
-      </w:r>
-      <w:commentRangeEnd w:id="27"/>
+        </w:rPr>
+        <w:commentReference w:id="25"/>
+      </w:r>
+      <w:commentRangeEnd w:id="26"/>
       <w:r>
         <w:rPr>
           <w:rStyle w:val="CommentReference"/>
           <w:rFonts w:ascii="Arial" w:hAnsi="Arial" w:cs="Arial"/>
           <w:sz w:val="22"/>
           <w:szCs w:val="22"/>
-          <w:highlight w:val="yellow"/>
-        </w:rPr>
-        <w:commentReference w:id="27"/>
-      </w:r>
-      <w:commentRangeEnd w:id="28"/>
+        </w:rPr>
+        <w:commentReference w:id="26"/>
+      </w:r>
+      <w:commentRangeEnd w:id="27"/>
       <w:r>
         <w:rPr>
           <w:rStyle w:val="CommentReference"/>
           <w:rFonts w:ascii="Arial" w:hAnsi="Arial" w:cs="Arial"/>
           <w:sz w:val="22"/>
           <w:szCs w:val="22"/>
-          <w:highlight w:val="yellow"/>
-        </w:rPr>
-        <w:commentReference w:id="28"/>
+        </w:rPr>
+        <w:commentReference w:id="27"/>
       </w:r>
     </w:p>
     <w:p>
@@ -4128,44 +5135,39 @@
         <w:contextualSpacing w:val="0"/>
         <w:rPr>
           <w:rFonts w:ascii="Arial" w:hAnsi="Arial" w:cs="Arial"/>
-          <w:highlight w:val="yellow"/>
-        </w:rPr>
-      </w:pPr>
+        </w:rPr>
+      </w:pPr>
+      <w:commentRangeStart w:id="28"/>
       <w:commentRangeStart w:id="29"/>
-      <w:commentRangeStart w:id="30"/>
-      <w:r>
-        <w:rPr>
-          <w:rFonts w:ascii="Arial" w:hAnsi="Arial" w:cs="Arial"/>
-          <w:highlight w:val="yellow"/>
+      <w:r>
+        <w:rPr>
+          <w:rFonts w:ascii="Arial" w:hAnsi="Arial" w:cs="Arial"/>
         </w:rPr>
         <w:t>Open Hyperspec III</w:t>
       </w:r>
-      <w:commentRangeEnd w:id="29"/>
+      <w:commentRangeEnd w:id="28"/>
       <w:r>
         <w:rPr>
           <w:rStyle w:val="CommentReference"/>
           <w:rFonts w:ascii="Arial" w:hAnsi="Arial" w:cs="Arial"/>
           <w:sz w:val="22"/>
           <w:szCs w:val="22"/>
-          <w:highlight w:val="yellow"/>
-        </w:rPr>
-        <w:commentReference w:id="29"/>
-      </w:r>
-      <w:commentRangeEnd w:id="30"/>
+        </w:rPr>
+        <w:commentReference w:id="28"/>
+      </w:r>
+      <w:commentRangeEnd w:id="29"/>
       <w:r>
         <w:rPr>
           <w:rStyle w:val="CommentReference"/>
           <w:rFonts w:ascii="Arial" w:hAnsi="Arial" w:cs="Arial"/>
           <w:sz w:val="22"/>
           <w:szCs w:val="22"/>
-          <w:highlight w:val="yellow"/>
-        </w:rPr>
-        <w:commentReference w:id="30"/>
-      </w:r>
-      <w:r>
-        <w:rPr>
-          <w:rFonts w:ascii="Arial" w:hAnsi="Arial" w:cs="Arial"/>
-          <w:highlight w:val="yellow"/>
+        </w:rPr>
+        <w:commentReference w:id="29"/>
+      </w:r>
+      <w:r>
+        <w:rPr>
+          <w:rFonts w:ascii="Arial" w:hAnsi="Arial" w:cs="Arial"/>
         </w:rPr>
         <w:t>.</w:t>
       </w:r>
@@ -4181,138 +5183,127 @@
         <w:contextualSpacing w:val="0"/>
         <w:rPr>
           <w:rFonts w:ascii="Arial" w:hAnsi="Arial" w:cs="Arial"/>
-          <w:highlight w:val="yellow"/>
-        </w:rPr>
-      </w:pPr>
-      <w:r>
-        <w:rPr>
-          <w:rFonts w:ascii="Arial" w:hAnsi="Arial" w:cs="Arial"/>
-          <w:highlight w:val="yellow"/>
+        </w:rPr>
+      </w:pPr>
+      <w:r>
+        <w:rPr>
+          <w:rFonts w:ascii="Arial" w:hAnsi="Arial" w:cs="Arial"/>
         </w:rPr>
         <w:t xml:space="preserve">Wait 2–3 minutes for SWIR sensor to achieve capture </w:t>
       </w:r>
+      <w:commentRangeStart w:id="30"/>
       <w:commentRangeStart w:id="31"/>
-      <w:commentRangeStart w:id="32"/>
-      <w:r>
-        <w:rPr>
-          <w:rFonts w:ascii="Arial" w:hAnsi="Arial" w:cs="Arial"/>
-          <w:highlight w:val="yellow"/>
+      <w:r>
+        <w:rPr>
+          <w:rFonts w:ascii="Arial" w:hAnsi="Arial" w:cs="Arial"/>
         </w:rPr>
         <w:t>temperature</w:t>
       </w:r>
-      <w:commentRangeEnd w:id="31"/>
+      <w:commentRangeEnd w:id="30"/>
       <w:r>
         <w:rPr>
           <w:rStyle w:val="CommentReference"/>
           <w:rFonts w:ascii="Arial" w:hAnsi="Arial" w:cs="Arial"/>
           <w:sz w:val="22"/>
           <w:szCs w:val="22"/>
-          <w:highlight w:val="yellow"/>
-        </w:rPr>
-        <w:commentReference w:id="31"/>
-      </w:r>
-      <w:commentRangeEnd w:id="32"/>
+        </w:rPr>
+        <w:commentReference w:id="30"/>
+      </w:r>
+      <w:commentRangeEnd w:id="31"/>
       <w:r>
         <w:rPr>
           <w:rStyle w:val="CommentReference"/>
           <w:rFonts w:ascii="Arial" w:hAnsi="Arial" w:cs="Arial"/>
           <w:sz w:val="22"/>
           <w:szCs w:val="22"/>
-          <w:highlight w:val="yellow"/>
-        </w:rPr>
-        <w:commentReference w:id="32"/>
-      </w:r>
-      <w:r>
-        <w:rPr>
-          <w:rFonts w:ascii="Arial" w:hAnsi="Arial" w:cs="Arial"/>
-          <w:highlight w:val="yellow"/>
+        </w:rPr>
+        <w:commentReference w:id="31"/>
+      </w:r>
+      <w:r>
+        <w:rPr>
+          <w:rFonts w:ascii="Arial" w:hAnsi="Arial" w:cs="Arial"/>
         </w:rPr>
         <w:t>.</w:t>
       </w:r>
       <w:r>
         <w:rPr>
           <w:rFonts w:ascii="Arial" w:hAnsi="Arial" w:cs="Arial"/>
-          <w:highlight w:val="yellow"/>
         </w:rPr>
         <w:t xml:space="preserve"> Hyperspec III</w:t>
       </w:r>
+      <w:commentRangeStart w:id="32"/>
       <w:commentRangeStart w:id="33"/>
-      <w:commentRangeStart w:id="34"/>
-      <w:commentRangeEnd w:id="33"/>
+      <w:commentRangeEnd w:id="32"/>
       <w:r>
         <w:rPr>
           <w:rStyle w:val="CommentReference"/>
           <w:rFonts w:ascii="Arial" w:hAnsi="Arial" w:cs="Arial"/>
           <w:sz w:val="22"/>
           <w:szCs w:val="22"/>
-          <w:highlight w:val="yellow"/>
-        </w:rPr>
-        <w:commentReference w:id="33"/>
-      </w:r>
-      <w:commentRangeEnd w:id="34"/>
+        </w:rPr>
+        <w:commentReference w:id="32"/>
+      </w:r>
+      <w:commentRangeEnd w:id="33"/>
       <w:r>
         <w:rPr>
           <w:rStyle w:val="CommentReference"/>
           <w:rFonts w:ascii="Arial" w:hAnsi="Arial" w:cs="Arial"/>
           <w:sz w:val="22"/>
           <w:szCs w:val="22"/>
-          <w:highlight w:val="yellow"/>
-        </w:rPr>
-        <w:commentReference w:id="34"/>
-      </w:r>
-      <w:r>
-        <w:rPr>
-          <w:rFonts w:ascii="Arial" w:hAnsi="Arial" w:cs="Arial"/>
-          <w:highlight w:val="yellow"/>
+        </w:rPr>
+        <w:commentReference w:id="33"/>
+      </w:r>
+      <w:r>
+        <w:rPr>
+          <w:rFonts w:ascii="Arial" w:hAnsi="Arial" w:cs="Arial"/>
         </w:rPr>
         <w:t xml:space="preserve"> </w:t>
       </w:r>
       <w:r>
         <w:rPr>
           <w:rFonts w:ascii="Arial" w:hAnsi="Arial" w:cs="Arial"/>
-          <w:highlight w:val="yellow"/>
         </w:rPr>
         <w:t>won't</w:t>
       </w:r>
       <w:r>
         <w:rPr>
           <w:rFonts w:ascii="Arial" w:hAnsi="Arial" w:cs="Arial"/>
-          <w:highlight w:val="yellow"/>
         </w:rPr>
         <w:t xml:space="preserve"> connect to the SWIR </w:t>
       </w:r>
       <w:r>
         <w:rPr>
           <w:rFonts w:ascii="Arial" w:hAnsi="Arial" w:cs="Arial"/>
-          <w:highlight w:val="yellow"/>
-        </w:rPr>
-        <w:t xml:space="preserve">is at </w:t>
-      </w:r>
-      <w:r>
-        <w:rPr>
-          <w:rFonts w:ascii="Arial" w:hAnsi="Arial" w:cs="Arial"/>
-          <w:highlight w:val="yellow"/>
+        </w:rPr>
+        <w:t>until it’s</w:t>
+      </w:r>
+      <w:r>
+        <w:rPr>
+          <w:rFonts w:ascii="Arial" w:hAnsi="Arial" w:cs="Arial"/>
+        </w:rPr>
+        <w:t xml:space="preserve"> at </w:t>
+      </w:r>
+      <w:r>
+        <w:rPr>
+          <w:rFonts w:ascii="Arial" w:hAnsi="Arial" w:cs="Arial"/>
         </w:rPr>
         <w:t>temperature</w:t>
       </w:r>
       <w:r>
         <w:rPr>
           <w:rFonts w:ascii="Arial" w:hAnsi="Arial" w:cs="Arial"/>
-          <w:highlight w:val="yellow"/>
         </w:rPr>
         <w:t>.</w:t>
       </w:r>
       <w:r>
         <w:rPr>
           <w:rFonts w:ascii="Arial" w:hAnsi="Arial" w:cs="Arial"/>
-          <w:highlight w:val="yellow"/>
         </w:rPr>
         <w:t xml:space="preserve"> </w:t>
       </w:r>
       <w:r>
         <w:rPr>
           <w:rFonts w:ascii="Arial" w:hAnsi="Arial" w:cs="Arial"/>
-          <w:highlight w:val="yellow"/>
         </w:rPr>
         <w:t>(Listen for the click)</w:t>
       </w:r>
@@ -4376,7 +5367,7 @@
         </w:rPr>
         <w:t xml:space="preserve">Set Frame Period based on flight parameters using </w:t>
       </w:r>
-      <w:hyperlink r:id="rId22">
+      <w:hyperlink r:id="rId30">
         <w:r>
           <w:rPr>
             <w:rStyle w:val="Hyperlink"/>
@@ -4514,15 +5505,15 @@
           <w:rFonts w:ascii="Arial" w:hAnsi="Arial" w:cs="Arial"/>
         </w:rPr>
       </w:pPr>
+      <w:commentRangeStart w:id="34"/>
       <w:commentRangeStart w:id="35"/>
-      <w:commentRangeStart w:id="36"/>
       <w:r>
         <w:rPr>
           <w:rFonts w:ascii="Arial" w:hAnsi="Arial" w:cs="Arial"/>
         </w:rPr>
         <w:t>When adjusting Exposure, use the lowest gain mode possible while still achieving sufficient saturation to boost SNR, without adjusting frame period.</w:t>
       </w:r>
-      <w:commentRangeEnd w:id="35"/>
+      <w:commentRangeEnd w:id="34"/>
       <w:r>
         <w:rPr>
           <w:rStyle w:val="CommentReference"/>
@@ -4530,9 +5521,9 @@
           <w:sz w:val="22"/>
           <w:szCs w:val="22"/>
         </w:rPr>
-        <w:commentReference w:id="35"/>
-      </w:r>
-      <w:commentRangeEnd w:id="36"/>
+        <w:commentReference w:id="34"/>
+      </w:r>
+      <w:commentRangeEnd w:id="35"/>
       <w:r>
         <w:rPr>
           <w:rStyle w:val="CommentReference"/>
@@ -4540,7 +5531,7 @@
           <w:sz w:val="22"/>
           <w:szCs w:val="22"/>
         </w:rPr>
-        <w:commentReference w:id="36"/>
+        <w:commentReference w:id="35"/>
       </w:r>
     </w:p>
     <w:p>
@@ -4610,7 +5601,7 @@
         <w:pStyle w:val="ListParagraph"/>
         <w:numPr>
           <w:ilvl w:val="0"/>
-          <w:numId w:val="22"/>
+          <w:numId w:val="12"/>
         </w:numPr>
         <w:spacing w:after="40" w:line="240" w:lineRule="auto"/>
         <w:contextualSpacing w:val="0"/>
@@ -4624,7 +5615,7 @@
           <w:rFonts w:ascii="Arial" w:hAnsi="Arial" w:cs="Arial"/>
           <w:highlight w:val="yellow"/>
         </w:rPr>
-        <w:t>Toggle Hyperspec III to the SWIR sensor.</w:t>
+        <w:t>Add in here angle and photo</w:t>
       </w:r>
     </w:p>
     <w:p>
@@ -4638,15 +5629,13 @@
         <w:contextualSpacing w:val="0"/>
         <w:rPr>
           <w:rFonts w:ascii="Arial" w:hAnsi="Arial" w:cs="Arial"/>
-          <w:highlight w:val="yellow"/>
-        </w:rPr>
-      </w:pPr>
-      <w:r>
-        <w:rPr>
-          <w:rFonts w:ascii="Arial" w:hAnsi="Arial" w:cs="Arial"/>
-          <w:highlight w:val="yellow"/>
-        </w:rPr>
-        <w:t>Repeat frame period/exposure steps for the SWIR sensor.</w:t>
+        </w:rPr>
+      </w:pPr>
+      <w:r>
+        <w:rPr>
+          <w:rFonts w:ascii="Arial" w:hAnsi="Arial" w:cs="Arial"/>
+        </w:rPr>
+        <w:t>Toggle Hyperspec III to the SWIR sensor.</w:t>
       </w:r>
     </w:p>
     <w:p>
@@ -4666,7 +5655,7 @@
         <w:rPr>
           <w:rFonts w:ascii="Arial" w:hAnsi="Arial" w:cs="Arial"/>
         </w:rPr>
-        <w:t>Open GPS tab.</w:t>
+        <w:t>Repeat frame period/exposure steps for the SWIR sensor.</w:t>
       </w:r>
     </w:p>
     <w:p>
@@ -4686,6 +5675,26 @@
         <w:rPr>
           <w:rFonts w:ascii="Arial" w:hAnsi="Arial" w:cs="Arial"/>
         </w:rPr>
+        <w:t>Open GPS tab.</w:t>
+      </w:r>
+    </w:p>
+    <w:p>
+      <w:pPr>
+        <w:pStyle w:val="ListParagraph"/>
+        <w:numPr>
+          <w:ilvl w:val="0"/>
+          <w:numId w:val="22"/>
+        </w:numPr>
+        <w:spacing w:after="40" w:line="240" w:lineRule="auto"/>
+        <w:contextualSpacing w:val="0"/>
+        <w:rPr>
+          <w:rFonts w:ascii="Arial" w:hAnsi="Arial" w:cs="Arial"/>
+        </w:rPr>
+      </w:pPr>
+      <w:r>
+        <w:rPr>
+          <w:rFonts w:ascii="Arial" w:hAnsi="Arial" w:cs="Arial"/>
+        </w:rPr>
         <w:t>Upload HSI polygon KML file.</w:t>
       </w:r>
     </w:p>
@@ -4762,14 +5771,14 @@
           <w:rFonts w:ascii="Arial" w:hAnsi="Arial" w:cs="Arial"/>
         </w:rPr>
       </w:pPr>
-      <w:commentRangeStart w:id="37"/>
+      <w:commentRangeStart w:id="36"/>
       <w:r>
         <w:rPr>
           <w:rFonts w:ascii="Arial" w:hAnsi="Arial" w:cs="Arial"/>
         </w:rPr>
         <w:t>Update the name of the data collection folder</w:t>
       </w:r>
-      <w:commentRangeEnd w:id="37"/>
+      <w:commentRangeEnd w:id="36"/>
       <w:r>
         <w:rPr>
           <w:rStyle w:val="CommentReference"/>
@@ -4777,7 +5786,7 @@
           <w:sz w:val="22"/>
           <w:szCs w:val="22"/>
         </w:rPr>
-        <w:commentReference w:id="37"/>
+        <w:commentReference w:id="36"/>
       </w:r>
       <w:r>
         <w:rPr>
@@ -4889,7 +5898,6 @@
         <w:rPr>
           <w:rFonts w:ascii="Arial" w:hAnsi="Arial" w:cs="Arial"/>
         </w:rPr>
-        <w:lastRenderedPageBreak/>
         <w:t>Click Start.</w:t>
       </w:r>
     </w:p>
@@ -4966,7 +5974,7 @@
           <w:rFonts w:ascii="Arial" w:hAnsi="Arial" w:cs="Arial"/>
         </w:rPr>
       </w:pPr>
-      <w:commentRangeStart w:id="38"/>
+      <w:commentRangeStart w:id="37"/>
       <w:r>
         <w:rPr>
           <w:rFonts w:ascii="Arial" w:hAnsi="Arial" w:cs="Arial"/>
@@ -5005,7 +6013,7 @@
         </w:rPr>
         <w:t>5–10 m above ground at minimum, preferably at least 20 m below flight altitude if possible.</w:t>
       </w:r>
-      <w:commentRangeEnd w:id="38"/>
+      <w:commentRangeEnd w:id="37"/>
       <w:r>
         <w:rPr>
           <w:rStyle w:val="CommentReference"/>
@@ -5013,7 +6021,7 @@
           <w:sz w:val="22"/>
           <w:szCs w:val="22"/>
         </w:rPr>
-        <w:commentReference w:id="38"/>
+        <w:commentReference w:id="37"/>
       </w:r>
     </w:p>
     <w:p>
@@ -5753,7 +6761,6 @@
         <w:rPr>
           <w:rFonts w:ascii="Arial" w:hAnsi="Arial" w:cs="Arial"/>
         </w:rPr>
-        <w:lastRenderedPageBreak/>
         <w:t>In web browser, connect to APX Web Configuration @ 10.0.65.51:8080</w:t>
       </w:r>
     </w:p>
@@ -5798,6 +6805,30 @@
         </w:rPr>
         <w:t>Turn off the drone and sensor.</w:t>
       </w:r>
+    </w:p>
+    <w:p>
+      <w:pPr>
+        <w:spacing w:after="40" w:line="240" w:lineRule="auto"/>
+        <w:rPr>
+          <w:rFonts w:ascii="Arial" w:hAnsi="Arial" w:cs="Arial"/>
+        </w:rPr>
+      </w:pPr>
+    </w:p>
+    <w:p>
+      <w:pPr>
+        <w:spacing w:after="40" w:line="240" w:lineRule="auto"/>
+        <w:rPr>
+          <w:rFonts w:ascii="Arial" w:hAnsi="Arial" w:cs="Arial"/>
+        </w:rPr>
+      </w:pPr>
+    </w:p>
+    <w:p>
+      <w:pPr>
+        <w:spacing w:after="40" w:line="240" w:lineRule="auto"/>
+        <w:rPr>
+          <w:rFonts w:ascii="Arial" w:hAnsi="Arial" w:cs="Arial"/>
+        </w:rPr>
+      </w:pPr>
     </w:p>
     <w:p>
       <w:pPr>
@@ -6586,6 +7617,38 @@
     </w:p>
     <w:p>
       <w:pPr>
+        <w:spacing w:after="40" w:line="240" w:lineRule="auto"/>
+        <w:rPr>
+          <w:rFonts w:ascii="Arial" w:hAnsi="Arial" w:cs="Arial"/>
+        </w:rPr>
+      </w:pPr>
+    </w:p>
+    <w:p>
+      <w:pPr>
+        <w:spacing w:after="40" w:line="240" w:lineRule="auto"/>
+        <w:rPr>
+          <w:rFonts w:ascii="Arial" w:hAnsi="Arial" w:cs="Arial"/>
+        </w:rPr>
+      </w:pPr>
+    </w:p>
+    <w:p>
+      <w:pPr>
+        <w:spacing w:after="40" w:line="240" w:lineRule="auto"/>
+        <w:rPr>
+          <w:rFonts w:ascii="Arial" w:hAnsi="Arial" w:cs="Arial"/>
+        </w:rPr>
+      </w:pPr>
+    </w:p>
+    <w:p>
+      <w:pPr>
+        <w:spacing w:after="40" w:line="240" w:lineRule="auto"/>
+        <w:rPr>
+          <w:rFonts w:ascii="Arial" w:hAnsi="Arial" w:cs="Arial"/>
+        </w:rPr>
+      </w:pPr>
+    </w:p>
+    <w:p>
+      <w:pPr>
         <w:pBdr>
           <w:top w:val="single" w:sz="12" w:space="1" w:color="auto"/>
           <w:bottom w:val="single" w:sz="12" w:space="1" w:color="auto"/>
@@ -6607,11 +7670,10 @@
           <w:color w:val="6F901E"/>
           <w:sz w:val="32"/>
         </w:rPr>
-        <w:lastRenderedPageBreak/>
         <w:t>DATA CONFIRMATION &amp; DOWNLOAD</w:t>
       </w:r>
-      <w:commentRangeStart w:id="39"/>
-      <w:commentRangeEnd w:id="39"/>
+      <w:commentRangeStart w:id="38"/>
+      <w:commentRangeEnd w:id="38"/>
       <w:r>
         <w:rPr>
           <w:rStyle w:val="CommentReference"/>
@@ -6621,7 +7683,7 @@
           <w:sz w:val="32"/>
           <w:szCs w:val="22"/>
         </w:rPr>
-        <w:commentReference w:id="39"/>
+        <w:commentReference w:id="38"/>
       </w:r>
     </w:p>
     <w:tbl>
@@ -7582,11 +8644,11 @@
       </w:pPr>
     </w:p>
     <w:sectPr>
-      <w:headerReference w:type="even" r:id="rId23"/>
-      <w:headerReference w:type="default" r:id="rId24"/>
-      <w:footerReference w:type="default" r:id="rId25"/>
-      <w:headerReference w:type="first" r:id="rId26"/>
-      <w:footerReference w:type="first" r:id="rId27"/>
+      <w:headerReference w:type="even" r:id="rId31"/>
+      <w:headerReference w:type="default" r:id="rId32"/>
+      <w:footerReference w:type="default" r:id="rId33"/>
+      <w:headerReference w:type="first" r:id="rId34"/>
+      <w:footerReference w:type="first" r:id="rId35"/>
       <w:pgSz w:w="11900" w:h="16840"/>
       <w:pgMar w:top="860" w:right="720" w:bottom="720" w:left="720" w:header="680" w:footer="680" w:gutter="0"/>
       <w:cols w:space="708"/>
@@ -7771,7 +8833,7 @@
       </w:r>
     </w:p>
   </w:comment>
-  <w:comment w:id="10" w:author="Warin Chotirosniramit" w:date="2026-04-17T13:17:00Z" w:initials="WC">
+  <w:comment w:id="10" w:author="Bipul Neupane" w:date="2026-04-13T13:10:00Z" w:initials="BN">
     <w:p>
       <w:pPr>
         <w:pStyle w:val="CommentText"/>
@@ -7783,24 +8845,78 @@
         <w:annotationRef/>
       </w:r>
       <w:r>
-        <w:t xml:space="preserve">Can we include details on launching Qgroundcontrol? Like switching on the IF1200, connecting it via wifi, and stuff. To be completely idiot-proof. </w:t>
-      </w:r>
-    </w:p>
+        <w:t>More details on camera settings parameters maybe needed: sensor width/height, image w/h, focal length.</w:t>
+      </w:r>
+    </w:p>
+  </w:comment>
+  <w:comment w:id="11" w:author="Richard Harwood" w:date="2026-04-13T15:05:00Z" w:initials="RH">
     <w:p>
       <w:pPr>
         <w:pStyle w:val="CommentText"/>
       </w:pPr>
-    </w:p>
+      <w:r>
+        <w:rPr>
+          <w:rStyle w:val="CommentReference"/>
+        </w:rPr>
+        <w:annotationRef/>
+      </w:r>
+      <w:r>
+        <w:t>Can we set these in stone?</w:t>
+      </w:r>
+    </w:p>
+  </w:comment>
+  <w:comment w:id="13" w:author="Connor Cassidy" w:date="2026-04-23T12:04:00Z" w:initials="CC">
     <w:p>
       <w:pPr>
         <w:pStyle w:val="CommentText"/>
       </w:pPr>
       <w:r>
-        <w:t xml:space="preserve">Also some people use the software on the controller, some use on the laptop. I think there are some advantages and disadvantages for each method. Can it be documented in which situation to use controller and which to use the laptop? </w:t>
+        <w:rPr>
+          <w:rStyle w:val="CommentReference"/>
+        </w:rPr>
+        <w:annotationRef/>
+      </w:r>
+      <w:r>
+        <w:t xml:space="preserve">I strongly believe flying in a North-South direction is more impostant than flying in direction of planting. </w:t>
       </w:r>
     </w:p>
   </w:comment>
-  <w:comment w:id="11" w:author="William Salter" w:date="2026-04-22T10:07:00Z" w:initials="WS">
+  <w:comment w:id="12" w:author="Hammad Khan" w:date="2026-04-16T11:42:00Z" w:initials="HK">
+    <w:p>
+      <w:pPr>
+        <w:pStyle w:val="CommentText"/>
+      </w:pPr>
+      <w:r>
+        <w:rPr>
+          <w:rStyle w:val="CommentReference"/>
+        </w:rPr>
+        <w:annotationRef/>
+      </w:r>
+      <w:r>
+        <w:rPr>
+          <w:lang w:val="en-AU"/>
+        </w:rPr>
+        <w:t>We need to discuss the North-Side rule or planting direction.</w:t>
+      </w:r>
+    </w:p>
+  </w:comment>
+  <w:comment w:id="14" w:author="Daniel Smith" w:date="2026-04-16T12:48:00Z" w:initials="DS">
+    <w:p>
+      <w:pPr>
+        <w:pStyle w:val="CommentText"/>
+      </w:pPr>
+      <w:r>
+        <w:rPr>
+          <w:rStyle w:val="CommentReference"/>
+        </w:rPr>
+        <w:annotationRef/>
+      </w:r>
+      <w:r>
+        <w:t xml:space="preserve">Apex to test optimal orientation. </w:t>
+      </w:r>
+    </w:p>
+  </w:comment>
+  <w:comment w:id="15" w:author="William Salter" w:date="2026-04-12T16:45:00Z" w:initials="WS">
     <w:p>
       <w:r>
         <w:rPr>
@@ -7813,11 +8929,11 @@
           <w:sz w:val="20"/>
           <w:szCs w:val="20"/>
         </w:rPr>
-        <w:t>@connor, can you please review and add in these details</w:t>
+        <w:t>Need to add flight planning steps before this?</w:t>
       </w:r>
     </w:p>
   </w:comment>
-  <w:comment w:id="12" w:author="Bipul Neupane" w:date="2026-04-13T13:10:00Z" w:initials="BN">
+  <w:comment w:id="16" w:author="Connor Cassidy" w:date="2026-04-13T00:01:00Z" w:initials="CC">
     <w:p>
       <w:pPr>
         <w:pStyle w:val="CommentText"/>
@@ -7829,11 +8945,14 @@
         <w:annotationRef/>
       </w:r>
       <w:r>
-        <w:t>More details on camera settings parameters maybe needed: sensor width/height, image w/h, focal length.</w:t>
+        <w:rPr>
+          <w:lang w:val="en-AU"/>
+        </w:rPr>
+        <w:t xml:space="preserve">A trimmed flight planning section has been provided. </w:t>
       </w:r>
     </w:p>
   </w:comment>
-  <w:comment w:id="13" w:author="Richard Harwood" w:date="2026-04-13T15:05:00Z" w:initials="RH">
+  <w:comment w:id="17" w:author="l.cave" w:date="2026-04-20T13:34:00Z" w:initials="l.">
     <w:p>
       <w:pPr>
         <w:pStyle w:val="CommentText"/>
@@ -7845,98 +8964,11 @@
         <w:annotationRef/>
       </w:r>
       <w:r>
-        <w:t>Can we set these in stone?</w:t>
+        <w:t>This is a bit ambiguous and depends heavily on latitude</w:t>
       </w:r>
     </w:p>
   </w:comment>
-  <w:comment w:id="14" w:author="Hammad Khan" w:date="2026-04-16T11:42:00Z" w:initials="HK">
-    <w:p>
-      <w:pPr>
-        <w:pStyle w:val="CommentText"/>
-      </w:pPr>
-      <w:r>
-        <w:rPr>
-          <w:rStyle w:val="CommentReference"/>
-        </w:rPr>
-        <w:annotationRef/>
-      </w:r>
-      <w:r>
-        <w:rPr>
-          <w:lang w:val="en-AU"/>
-        </w:rPr>
-        <w:t>We need to discuss the North-Side rule or planting direction.</w:t>
-      </w:r>
-    </w:p>
-  </w:comment>
-  <w:comment w:id="15" w:author="Daniel Smith" w:date="2026-04-16T12:48:00Z" w:initials="DS">
-    <w:p>
-      <w:pPr>
-        <w:pStyle w:val="CommentText"/>
-      </w:pPr>
-      <w:r>
-        <w:rPr>
-          <w:rStyle w:val="CommentReference"/>
-        </w:rPr>
-        <w:annotationRef/>
-      </w:r>
-      <w:r>
-        <w:t xml:space="preserve">Apex to test optimal orientation. </w:t>
-      </w:r>
-    </w:p>
-  </w:comment>
-  <w:comment w:id="16" w:author="William Salter" w:date="2026-04-12T16:45:00Z" w:initials="WS">
-    <w:p>
-      <w:r>
-        <w:rPr>
-          <w:rStyle w:val="CommentReference"/>
-        </w:rPr>
-        <w:annotationRef/>
-      </w:r>
-      <w:r>
-        <w:rPr>
-          <w:sz w:val="20"/>
-          <w:szCs w:val="20"/>
-        </w:rPr>
-        <w:t>Need to add flight planning steps before this?</w:t>
-      </w:r>
-    </w:p>
-  </w:comment>
-  <w:comment w:id="17" w:author="Connor Cassidy" w:date="2026-04-13T00:01:00Z" w:initials="CC">
-    <w:p>
-      <w:pPr>
-        <w:pStyle w:val="CommentText"/>
-      </w:pPr>
-      <w:r>
-        <w:rPr>
-          <w:rStyle w:val="CommentReference"/>
-        </w:rPr>
-        <w:annotationRef/>
-      </w:r>
-      <w:r>
-        <w:rPr>
-          <w:lang w:val="en-AU"/>
-        </w:rPr>
-        <w:t xml:space="preserve">A trimmed flight planning section has been provided. </w:t>
-      </w:r>
-    </w:p>
-  </w:comment>
-  <w:comment w:id="18" w:author="l.cave" w:date="2026-04-20T13:34:00Z" w:initials="l.">
-    <w:p>
-      <w:pPr>
-        <w:pStyle w:val="CommentText"/>
-      </w:pPr>
-      <w:r>
-        <w:rPr>
-          <w:rStyle w:val="CommentReference"/>
-        </w:rPr>
-        <w:annotationRef/>
-      </w:r>
-      <w:r>
-        <w:t>This is a bit ambiguous and depends heavily on latitude</w:t>
-      </w:r>
-    </w:p>
-  </w:comment>
-  <w:comment w:id="19" w:author="l.cave" w:date="2026-04-20T13:36:00Z" w:initials="l.">
+  <w:comment w:id="18" w:author="l.cave" w:date="2026-04-20T13:36:00Z" w:initials="l.">
     <w:p>
       <w:pPr>
         <w:pStyle w:val="CommentText"/>
@@ -8017,7 +9049,7 @@
       </w:r>
     </w:p>
   </w:comment>
-  <w:comment w:id="20" w:author="William Salter" w:date="2026-04-22T09:55:00Z" w:initials="WS">
+  <w:comment w:id="19" w:author="William Salter" w:date="2026-04-22T09:55:00Z" w:initials="WS">
     <w:p>
       <w:r>
         <w:rPr>
@@ -8034,7 +9066,7 @@
       </w:r>
     </w:p>
   </w:comment>
-  <w:comment w:id="21" w:author="Bipul Neupane" w:date="2026-04-13T12:44:00Z" w:initials="BN">
+  <w:comment w:id="20" w:author="Bipul Neupane" w:date="2026-04-13T12:44:00Z" w:initials="BN">
     <w:p>
       <w:pPr>
         <w:pStyle w:val="CommentText"/>
@@ -8050,7 +9082,7 @@
       </w:r>
     </w:p>
   </w:comment>
-  <w:comment w:id="22" w:author="Bipul Neupane" w:date="2026-04-13T13:14:00Z" w:initials="BN">
+  <w:comment w:id="21" w:author="Bipul Neupane" w:date="2026-04-13T13:14:00Z" w:initials="BN">
     <w:p>
       <w:pPr>
         <w:pStyle w:val="CommentText"/>
@@ -8066,7 +9098,7 @@
       </w:r>
     </w:p>
   </w:comment>
-  <w:comment w:id="23" w:author="Bipul Neupane" w:date="2026-04-13T13:19:00Z" w:initials="BN">
+  <w:comment w:id="22" w:author="Bipul Neupane" w:date="2026-04-13T13:19:00Z" w:initials="BN">
     <w:p>
       <w:pPr>
         <w:pStyle w:val="CommentText"/>
@@ -8082,7 +9114,7 @@
       </w:r>
     </w:p>
   </w:comment>
-  <w:comment w:id="24" w:author="Richard Harwood" w:date="2026-04-13T15:16:00Z" w:initials="RH">
+  <w:comment w:id="23" w:author="Richard Harwood" w:date="2026-04-13T15:16:00Z" w:initials="RH">
     <w:p>
       <w:pPr>
         <w:pStyle w:val="CommentText"/>
@@ -8098,7 +9130,7 @@
       </w:r>
     </w:p>
   </w:comment>
-  <w:comment w:id="25" w:author="Bipul Neupane" w:date="2026-04-13T12:48:00Z" w:initials="BN">
+  <w:comment w:id="24" w:author="Bipul Neupane" w:date="2026-04-13T12:48:00Z" w:initials="BN">
     <w:p>
       <w:pPr>
         <w:pStyle w:val="CommentText"/>
@@ -8114,7 +9146,7 @@
       </w:r>
     </w:p>
   </w:comment>
-  <w:comment w:id="26" w:author="Arden Burrell" w:date="2026-04-16T13:41:00Z" w:initials="AB">
+  <w:comment w:id="25" w:author="Arden Burrell" w:date="2026-04-16T13:41:00Z" w:initials="AB">
     <w:p>
       <w:pPr>
         <w:pStyle w:val="CommentText"/>
@@ -8130,7 +9162,7 @@
       </w:r>
     </w:p>
   </w:comment>
-  <w:comment w:id="27" w:author="Warin Chotirosniramit" w:date="2026-04-16T13:44:00Z" w:initials="WC">
+  <w:comment w:id="26" w:author="Warin Chotirosniramit" w:date="2026-04-16T13:44:00Z" w:initials="WC">
     <w:p>
       <w:pPr>
         <w:pStyle w:val="CommentText"/>
@@ -8154,7 +9186,7 @@
       </w:r>
     </w:p>
   </w:comment>
-  <w:comment w:id="28" w:author="William Salter" w:date="2026-04-22T09:58:00Z" w:initials="WS">
+  <w:comment w:id="27" w:author="William Salter" w:date="2026-04-22T09:58:00Z" w:initials="WS">
     <w:p>
       <w:r>
         <w:rPr>
@@ -8171,7 +9203,7 @@
       </w:r>
     </w:p>
   </w:comment>
-  <w:comment w:id="29" w:author="Hammad Khan" w:date="2026-04-13T12:24:00Z" w:initials="HK">
+  <w:comment w:id="28" w:author="Hammad Khan" w:date="2026-04-13T12:24:00Z" w:initials="HK">
     <w:p>
       <w:pPr>
         <w:pStyle w:val="CommentText"/>
@@ -8190,7 +9222,7 @@
       </w:r>
     </w:p>
   </w:comment>
-  <w:comment w:id="30" w:author="Bipul Neupane" w:date="2026-04-13T12:29:00Z" w:initials="BN">
+  <w:comment w:id="29" w:author="Bipul Neupane" w:date="2026-04-13T12:29:00Z" w:initials="BN">
     <w:p>
       <w:pPr>
         <w:pStyle w:val="CommentText"/>
@@ -8214,7 +9246,7 @@
       </w:hyperlink>
     </w:p>
   </w:comment>
-  <w:comment w:id="31" w:author="Bipul Neupane" w:date="2026-04-13T12:55:00Z" w:initials="BN">
+  <w:comment w:id="30" w:author="Bipul Neupane" w:date="2026-04-13T12:55:00Z" w:initials="BN">
     <w:p>
       <w:pPr>
         <w:pStyle w:val="CommentText"/>
@@ -8230,7 +9262,7 @@
       </w:r>
     </w:p>
   </w:comment>
-  <w:comment w:id="32" w:author="Richard Harwood" w:date="2026-04-13T14:57:00Z" w:initials="RH">
+  <w:comment w:id="31" w:author="Richard Harwood" w:date="2026-04-13T14:57:00Z" w:initials="RH">
     <w:p>
       <w:pPr>
         <w:pStyle w:val="CommentText"/>
@@ -8246,7 +9278,7 @@
       </w:r>
     </w:p>
   </w:comment>
-  <w:comment w:id="33" w:author="Hammad Khan" w:date="2026-04-13T05:24:00Z" w:initials="HK">
+  <w:comment w:id="32" w:author="Hammad Khan" w:date="2026-04-13T05:24:00Z" w:initials="HK">
     <w:p>
       <w:pPr>
         <w:pStyle w:val="CommentText"/>
@@ -8262,7 +9294,7 @@
       </w:r>
     </w:p>
   </w:comment>
-  <w:comment w:id="34" w:author="Bipul Neupane" w:date="2026-04-13T05:29:00Z" w:initials="BN">
+  <w:comment w:id="33" w:author="Bipul Neupane" w:date="2026-04-13T05:29:00Z" w:initials="BN">
     <w:p>
       <w:pPr>
         <w:pStyle w:val="CommentText"/>
@@ -8286,7 +9318,7 @@
       </w:hyperlink>
     </w:p>
   </w:comment>
-  <w:comment w:id="35" w:author="Arden Burrell" w:date="2026-04-16T13:55:00Z" w:initials="AB">
+  <w:comment w:id="34" w:author="Arden Burrell" w:date="2026-04-16T13:55:00Z" w:initials="AB">
     <w:p>
       <w:pPr>
         <w:pStyle w:val="CommentText"/>
@@ -8302,7 +9334,7 @@
       </w:r>
     </w:p>
   </w:comment>
-  <w:comment w:id="36" w:author="l.cave" w:date="2026-04-16T14:27:00Z" w:initials="l.">
+  <w:comment w:id="35" w:author="l.cave" w:date="2026-04-16T14:27:00Z" w:initials="l.">
     <w:p>
       <w:pPr>
         <w:pStyle w:val="CommentText"/>
@@ -8318,7 +9350,7 @@
       </w:r>
     </w:p>
   </w:comment>
-  <w:comment w:id="37" w:author="Bipul Neupane" w:date="2026-04-13T12:58:00Z" w:initials="BN">
+  <w:comment w:id="36" w:author="Bipul Neupane" w:date="2026-04-13T12:58:00Z" w:initials="BN">
     <w:p>
       <w:pPr>
         <w:pStyle w:val="CommentText"/>
@@ -8334,7 +9366,7 @@
       </w:r>
     </w:p>
   </w:comment>
-  <w:comment w:id="38" w:author="franco.renones" w:date="2026-04-13T15:09:00Z" w:initials="fr">
+  <w:comment w:id="37" w:author="franco.renones" w:date="2026-04-13T15:09:00Z" w:initials="fr">
     <w:p>
       <w:pPr>
         <w:pStyle w:val="CommentText"/>
@@ -8350,7 +9382,7 @@
       </w:r>
     </w:p>
   </w:comment>
-  <w:comment w:id="39" w:author="Richard Harwood" w:date="2026-04-13T14:59:00Z" w:initials="RH">
+  <w:comment w:id="38" w:author="Richard Harwood" w:date="2026-04-13T14:59:00Z" w:initials="RH">
     <w:p>
       <w:pPr>
         <w:pStyle w:val="CommentText"/>
@@ -8381,10 +9413,9 @@
   <w15:commentEx w15:paraId="77780A9D" w15:done="1"/>
   <w15:commentEx w15:paraId="2C9E582A" w15:done="1"/>
   <w15:commentEx w15:paraId="2F468930" w15:paraIdParent="2C9E582A" w15:done="1"/>
-  <w15:commentEx w15:paraId="01FDF787" w15:done="0"/>
-  <w15:commentEx w15:paraId="24501C0B" w15:paraIdParent="01FDF787" w15:done="0"/>
   <w15:commentEx w15:paraId="2C5FB454" w15:done="1"/>
   <w15:commentEx w15:paraId="63E84EB0" w15:done="1"/>
+  <w15:commentEx w15:paraId="180F2EE8" w15:done="0"/>
   <w15:commentEx w15:paraId="75CFCD57" w15:done="1"/>
   <w15:commentEx w15:paraId="1F59503C" w15:done="1"/>
   <w15:commentEx w15:paraId="109EE55F" w15:done="1"/>
@@ -8397,9 +9428,9 @@
   <w15:commentEx w15:paraId="75AADF00" w15:paraIdParent="724D04F4" w15:done="1"/>
   <w15:commentEx w15:paraId="28FB6B72" w15:done="1"/>
   <w15:commentEx w15:paraId="16B5A86C" w15:done="1"/>
-  <w15:commentEx w15:paraId="588ADD3F" w15:done="0"/>
-  <w15:commentEx w15:paraId="027EF0D3" w15:paraIdParent="588ADD3F" w15:done="0"/>
-  <w15:commentEx w15:paraId="3662C597" w15:paraIdParent="588ADD3F" w15:done="0"/>
+  <w15:commentEx w15:paraId="588ADD3F" w15:done="1"/>
+  <w15:commentEx w15:paraId="027EF0D3" w15:paraIdParent="588ADD3F" w15:done="1"/>
+  <w15:commentEx w15:paraId="3662C597" w15:paraIdParent="588ADD3F" w15:done="1"/>
   <w15:commentEx w15:paraId="7599B778" w15:done="1"/>
   <w15:commentEx w15:paraId="2362C03D" w15:paraIdParent="7599B778" w15:done="1"/>
   <w15:commentEx w15:paraId="23B2E39D" w15:done="1"/>
@@ -8426,10 +9457,9 @@
   <w16cex:commentExtensible w16cex:durableId="16B3C6E3" w16cex:dateUtc="2026-04-16T03:34:00Z"/>
   <w16cex:commentExtensible w16cex:durableId="64C596F2" w16cex:dateUtc="2026-04-16T01:45:00Z"/>
   <w16cex:commentExtensible w16cex:durableId="4A0D06ED" w16cex:dateUtc="2026-04-16T05:01:00Z"/>
-  <w16cex:commentExtensible w16cex:durableId="2F244D58" w16cex:dateUtc="2026-04-17T03:47:00Z"/>
-  <w16cex:commentExtensible w16cex:durableId="54540F28" w16cex:dateUtc="2026-04-22T00:07:00Z"/>
   <w16cex:commentExtensible w16cex:durableId="6D4D13C9" w16cex:dateUtc="2026-04-13T05:10:00Z"/>
   <w16cex:commentExtensible w16cex:durableId="1E11EA81" w16cex:dateUtc="2026-04-13T05:05:00Z"/>
+  <w16cex:commentExtensible w16cex:durableId="198B8431" w16cex:dateUtc="2026-04-23T02:04:00Z"/>
   <w16cex:commentExtensible w16cex:durableId="58636D0B" w16cex:dateUtc="2026-04-16T03:42:00Z"/>
   <w16cex:commentExtensible w16cex:durableId="1C7E2936" w16cex:dateUtc="2026-04-16T02:48:00Z"/>
   <w16cex:commentExtensible w16cex:durableId="0F2B1A3A" w16cex:dateUtc="2026-04-12T06:45:00Z"/>
@@ -8471,10 +9501,9 @@
   <w16cid:commentId w16cid:paraId="77780A9D" w16cid:durableId="16B3C6E3"/>
   <w16cid:commentId w16cid:paraId="2C9E582A" w16cid:durableId="64C596F2"/>
   <w16cid:commentId w16cid:paraId="2F468930" w16cid:durableId="4A0D06ED"/>
-  <w16cid:commentId w16cid:paraId="01FDF787" w16cid:durableId="2F244D58"/>
-  <w16cid:commentId w16cid:paraId="24501C0B" w16cid:durableId="54540F28"/>
   <w16cid:commentId w16cid:paraId="2C5FB454" w16cid:durableId="6D4D13C9"/>
   <w16cid:commentId w16cid:paraId="63E84EB0" w16cid:durableId="1E11EA81"/>
+  <w16cid:commentId w16cid:paraId="180F2EE8" w16cid:durableId="198B8431"/>
   <w16cid:commentId w16cid:paraId="75CFCD57" w16cid:durableId="58636D0B"/>
   <w16cid:commentId w16cid:paraId="1F59503C" w16cid:durableId="1C7E2936"/>
   <w16cid:commentId w16cid:paraId="109EE55F" w16cid:durableId="0F2B1A3A"/>
@@ -8679,7 +9708,7 @@
       <w:rPr>
         <w:noProof/>
       </w:rPr>
-      <w:pict w14:anchorId="31CBBE0B">
+      <w:pict w14:anchorId="4492D0D8">
         <v:shapetype id="_x0000_t75" coordsize="21600,21600" o:spt="75" o:preferrelative="t" path="m@4@5l@4@11@9@11@9@5xe" filled="f" stroked="f">
           <v:stroke joinstyle="miter"/>
           <v:formulas>
@@ -8699,7 +9728,7 @@
           <v:path o:extrusionok="f" gradientshapeok="t" o:connecttype="rect"/>
           <o:lock v:ext="edit" aspectratio="t"/>
         </v:shapetype>
-        <v:shape id="WordPictureWatermark786590333" o:spid="_x0000_s1025" type="#_x0000_t75" alt="/Clients/AgCommunicators/Ag Communicators/5284 AgCom Branding Roll Out - Stage 3/sent to client/final artwork/Letterhead/AGC Letterhead_FA_word.jpg" style="position:absolute;margin-left:0;margin-top:0;width:414.15pt;height:585.8pt;z-index:-251658240;mso-wrap-edited:f;mso-width-percent:0;mso-height-percent:0;mso-position-horizontal:center;mso-position-horizontal-relative:margin;mso-position-vertical:center;mso-position-vertical-relative:margin;mso-width-percent:0;mso-height-percent:0" o:allowincell="f">
+        <v:shape id="WordPictureWatermark786590333" o:spid="_x0000_s1025" type="#_x0000_t75" alt="/Clients/AgCommunicators/Ag Communicators/5284 AgCom Branding Roll Out - Stage 3/sent to client/final artwork/Letterhead/AGC Letterhead_FA_word.jpg" style="position:absolute;margin-left:0;margin-top:0;width:414.15pt;height:585.8pt;z-index:-251658239;mso-wrap-edited:f;mso-position-horizontal:center;mso-position-horizontal-relative:margin;mso-position-vertical:center;mso-position-vertical-relative:margin" o:allowincell="f">
           <v:imagedata r:id="rId1" o:title="AGC Letterhead_FA_word"/>
           <w10:wrap anchorx="margin" anchory="margin"/>
         </v:shape>
@@ -8825,7 +9854,7 @@
         <w:noProof/>
       </w:rPr>
       <w:drawing>
-        <wp:anchor distT="0" distB="0" distL="114300" distR="114300" simplePos="0" relativeHeight="251657216" behindDoc="1" locked="0" layoutInCell="1" allowOverlap="1" wp14:anchorId="45987D6C" wp14:editId="74A89E9E">
+        <wp:anchor distT="0" distB="0" distL="114300" distR="114300" simplePos="0" relativeHeight="251658240" behindDoc="1" locked="0" layoutInCell="1" allowOverlap="1" wp14:anchorId="45987D6C" wp14:editId="74A89E9E">
           <wp:simplePos x="0" y="0"/>
           <wp:positionH relativeFrom="page">
             <wp:align>center</wp:align>
@@ -13879,14 +14908,14 @@
   <w15:person w15:author="l.cave">
     <w15:presenceInfo w15:providerId="AD" w15:userId="S::l.cave_uq.edu.au#ext#@uao365.onmicrosoft.com::17fb3961-5317-4476-885a-d58ef2b6aced"/>
   </w15:person>
-  <w15:person w15:author="Warin Chotirosniramit">
-    <w15:presenceInfo w15:providerId="AD" w15:userId="S::warin.chotirosniramit_uwa.edu.au#ext#@uao365.onmicrosoft.com::914558ca-c802-49c5-8e12-054911fa7ae8"/>
-  </w15:person>
   <w15:person w15:author="Bipul Neupane">
     <w15:presenceInfo w15:providerId="AD" w15:userId="S::bipul.neupane_dpird.wa.gov.au#ext#@uao365.onmicrosoft.com::49351b36-a457-467a-8c95-260eda95dc78"/>
   </w15:person>
   <w15:person w15:author="Daniel Smith">
     <w15:presenceInfo w15:providerId="AD" w15:userId="S::daniel.smith3_uq.edu.au#ext#@uao365.onmicrosoft.com::17103300-b4ec-4871-806e-58bea049c7b7"/>
+  </w15:person>
+  <w15:person w15:author="Warin Chotirosniramit">
+    <w15:presenceInfo w15:providerId="AD" w15:userId="S::warin.chotirosniramit_uwa.edu.au#ext#@uao365.onmicrosoft.com::914558ca-c802-49c5-8e12-054911fa7ae8"/>
   </w15:person>
   <w15:person w15:author="franco.renones">
     <w15:presenceInfo w15:providerId="AD" w15:userId="S::franco.renones_uwa.edu.au#ext#@uao365.onmicrosoft.com::fbd66a15-57c3-4961-a2a2-d92004d1fbdf"/>
@@ -14513,6 +15542,18 @@
     <w:uiPriority w:val="99"/>
     <w:rsid w:val="005A604A"/>
   </w:style>
+  <w:style w:type="character" w:styleId="FollowedHyperlink">
+    <w:name w:val="FollowedHyperlink"/>
+    <w:basedOn w:val="DefaultParagraphFont"/>
+    <w:uiPriority w:val="99"/>
+    <w:semiHidden/>
+    <w:unhideWhenUsed/>
+    <w:rsid w:val="00142E2C"/>
+    <w:rPr>
+      <w:color w:val="800080" w:themeColor="followedHyperlink"/>
+      <w:u w:val="single"/>
+    </w:rPr>
+  </w:style>
 </w:styles>
 </file>
 
@@ -14837,22 +15878,16 @@
 </file>
 
 <file path=customXml/item1.xml><?xml version="1.0" encoding="utf-8"?>
-<p:properties xmlns:p="http://schemas.microsoft.com/office/2006/metadata/properties" xmlns:xsi="http://www.w3.org/2001/XMLSchema-instance" xmlns:pc="http://schemas.microsoft.com/office/infopath/2007/PartnerControls">
-  <documentManagement>
-    <lcf76f155ced4ddcb4097134ff3c332f xmlns="ce465580-9225-4807-8991-0a6595f564f1">
-      <Terms xmlns="http://schemas.microsoft.com/office/infopath/2007/PartnerControls"/>
-    </lcf76f155ced4ddcb4097134ff3c332f>
-  </documentManagement>
-</p:properties>
-</file>
-
-<file path=customXml/item2.xml><?xml version="1.0" encoding="utf-8"?>
 <?mso-contentType ?>
 <FormTemplates xmlns="http://schemas.microsoft.com/sharepoint/v3/contenttype/forms">
   <Display>DocumentLibraryForm</Display>
   <Edit>DocumentLibraryForm</Edit>
   <New>DocumentLibraryForm</New>
 </FormTemplates>
+</file>
+
+<file path=customXml/item2.xml><?xml version="1.0" encoding="utf-8"?>
+<b:Sources xmlns:b="http://schemas.openxmlformats.org/officeDocument/2006/bibliography" xmlns="http://schemas.openxmlformats.org/officeDocument/2006/bibliography" SelectedStyle="/APASixthEditionOfficeOnline.xsl" StyleName="APA" Version="6"/>
 </file>
 
 <file path=customXml/item3.xml><?xml version="1.0" encoding="utf-8"?>
@@ -15085,23 +16120,27 @@
 </file>
 
 <file path=customXml/item4.xml><?xml version="1.0" encoding="utf-8"?>
-<b:Sources xmlns:b="http://schemas.openxmlformats.org/officeDocument/2006/bibliography" xmlns="http://schemas.openxmlformats.org/officeDocument/2006/bibliography" SelectedStyle="/APASixthEditionOfficeOnline.xsl" StyleName="APA" Version="6"/>
+<p:properties xmlns:p="http://schemas.microsoft.com/office/2006/metadata/properties" xmlns:xsi="http://www.w3.org/2001/XMLSchema-instance" xmlns:pc="http://schemas.microsoft.com/office/infopath/2007/PartnerControls">
+  <documentManagement>
+    <lcf76f155ced4ddcb4097134ff3c332f xmlns="ce465580-9225-4807-8991-0a6595f564f1">
+      <Terms xmlns="http://schemas.microsoft.com/office/infopath/2007/PartnerControls"/>
+    </lcf76f155ced4ddcb4097134ff3c332f>
+  </documentManagement>
+</p:properties>
 </file>
 
 <file path=customXml/itemProps1.xml><?xml version="1.0" encoding="utf-8"?>
-<ds:datastoreItem xmlns:ds="http://schemas.openxmlformats.org/officeDocument/2006/customXml" ds:itemID="{1DCC56D1-3B2A-4D27-85C4-D10E1B37FA50}">
+<ds:datastoreItem xmlns:ds="http://schemas.openxmlformats.org/officeDocument/2006/customXml" ds:itemID="{056DF306-140E-4355-BB5D-258B42D545FE}">
   <ds:schemaRefs>
-    <ds:schemaRef ds:uri="http://schemas.microsoft.com/office/2006/metadata/properties"/>
-    <ds:schemaRef ds:uri="http://schemas.microsoft.com/office/infopath/2007/PartnerControls"/>
-    <ds:schemaRef ds:uri="ce465580-9225-4807-8991-0a6595f564f1"/>
+    <ds:schemaRef ds:uri="http://schemas.microsoft.com/sharepoint/v3/contenttype/forms"/>
   </ds:schemaRefs>
 </ds:datastoreItem>
 </file>
 
 <file path=customXml/itemProps2.xml><?xml version="1.0" encoding="utf-8"?>
-<ds:datastoreItem xmlns:ds="http://schemas.openxmlformats.org/officeDocument/2006/customXml" ds:itemID="{056DF306-140E-4355-BB5D-258B42D545FE}">
+<ds:datastoreItem xmlns:ds="http://schemas.openxmlformats.org/officeDocument/2006/customXml" ds:itemID="{36F1E090-DB68-F24A-B136-5E7CB3CFF402}">
   <ds:schemaRefs>
-    <ds:schemaRef ds:uri="http://schemas.microsoft.com/sharepoint/v3/contenttype/forms"/>
+    <ds:schemaRef ds:uri="http://schemas.openxmlformats.org/officeDocument/2006/bibliography"/>
   </ds:schemaRefs>
 </ds:datastoreItem>
 </file>
@@ -15126,9 +16165,11 @@
 </file>
 
 <file path=customXml/itemProps4.xml><?xml version="1.0" encoding="utf-8"?>
-<ds:datastoreItem xmlns:ds="http://schemas.openxmlformats.org/officeDocument/2006/customXml" ds:itemID="{36F1E090-DB68-F24A-B136-5E7CB3CFF402}">
+<ds:datastoreItem xmlns:ds="http://schemas.openxmlformats.org/officeDocument/2006/customXml" ds:itemID="{1DCC56D1-3B2A-4D27-85C4-D10E1B37FA50}">
   <ds:schemaRefs>
-    <ds:schemaRef ds:uri="http://schemas.openxmlformats.org/officeDocument/2006/bibliography"/>
+    <ds:schemaRef ds:uri="http://schemas.microsoft.com/office/2006/metadata/properties"/>
+    <ds:schemaRef ds:uri="http://schemas.microsoft.com/office/infopath/2007/PartnerControls"/>
+    <ds:schemaRef ds:uri="ce465580-9225-4807-8991-0a6595f564f1"/>
   </ds:schemaRefs>
 </ds:datastoreItem>
 </file>
</xml_diff>